<commit_message>
HW ISIT and monitoring
</commit_message>
<xml_diff>
--- a/Системы мониторинга и управления инцидентами ИБ/Практика 1.docx
+++ b/Системы мониторинга и управления инцидентами ИБ/Практика 1.docx
@@ -5,87 +5,289 @@
     <w:p>
       <w:r>
         <w:rPr>
-          <w:noProof/>
-          <w14:ligatures w14:val="standardContextual"/>
-        </w:rPr>
-        <mc:AlternateContent>
-          <mc:Choice Requires="wps">
-            <w:drawing>
-              <wp:anchor distT="0" distB="0" distL="114300" distR="114300" simplePos="0" relativeHeight="251659264" behindDoc="0" locked="0" layoutInCell="1" allowOverlap="1" wp14:anchorId="58AF6761" wp14:editId="0A864C9B">
-                <wp:simplePos x="0" y="0"/>
-                <wp:positionH relativeFrom="column">
-                  <wp:posOffset>1070398</wp:posOffset>
-                </wp:positionH>
-                <wp:positionV relativeFrom="paragraph">
-                  <wp:posOffset>794808</wp:posOffset>
-                </wp:positionV>
-                <wp:extent cx="2489200" cy="143934"/>
-                <wp:effectExtent l="0" t="0" r="25400" b="27940"/>
-                <wp:wrapNone/>
-                <wp:docPr id="714723234" name="Прямоугольник 1"/>
-                <wp:cNvGraphicFramePr/>
-                <a:graphic xmlns:a="http://schemas.openxmlformats.org/drawingml/2006/main">
-                  <a:graphicData uri="http://schemas.microsoft.com/office/word/2010/wordprocessingShape">
-                    <wps:wsp>
-                      <wps:cNvSpPr/>
-                      <wps:spPr>
-                        <a:xfrm>
-                          <a:off x="0" y="0"/>
-                          <a:ext cx="2489200" cy="143934"/>
-                        </a:xfrm>
-                        <a:prstGeom prst="rect">
-                          <a:avLst/>
-                        </a:prstGeom>
-                        <a:solidFill>
-                          <a:schemeClr val="bg1"/>
-                        </a:solidFill>
-                        <a:ln>
-                          <a:solidFill>
-                            <a:schemeClr val="bg1"/>
-                          </a:solidFill>
-                        </a:ln>
-                      </wps:spPr>
-                      <wps:style>
-                        <a:lnRef idx="2">
-                          <a:schemeClr val="accent1">
-                            <a:shade val="15000"/>
-                          </a:schemeClr>
-                        </a:lnRef>
-                        <a:fillRef idx="1">
-                          <a:schemeClr val="accent1"/>
-                        </a:fillRef>
-                        <a:effectRef idx="0">
-                          <a:schemeClr val="accent1"/>
-                        </a:effectRef>
-                        <a:fontRef idx="minor">
-                          <a:schemeClr val="lt1"/>
-                        </a:fontRef>
-                      </wps:style>
-                      <wps:bodyPr rot="0" spcFirstLastPara="0" vertOverflow="overflow" horzOverflow="overflow" vert="horz" wrap="square" lIns="91440" tIns="45720" rIns="91440" bIns="45720" numCol="1" spcCol="0" rtlCol="0" fromWordArt="0" anchor="ctr" anchorCtr="0" forceAA="0" compatLnSpc="1">
-                        <a:prstTxWarp prst="textNoShape">
-                          <a:avLst/>
-                        </a:prstTxWarp>
-                        <a:noAutofit/>
-                      </wps:bodyPr>
-                    </wps:wsp>
-                  </a:graphicData>
-                </a:graphic>
-              </wp:anchor>
-            </w:drawing>
-          </mc:Choice>
-          <mc:Fallback>
-            <w:pict>
-              <v:rect w14:anchorId="4B3CE266" id="Прямоугольник 1" o:spid="_x0000_s1026" style="position:absolute;margin-left:84.3pt;margin-top:62.6pt;width:196pt;height:11.35pt;z-index:251659264;visibility:visible;mso-wrap-style:square;mso-wrap-distance-left:9pt;mso-wrap-distance-top:0;mso-wrap-distance-right:9pt;mso-wrap-distance-bottom:0;mso-position-horizontal:absolute;mso-position-horizontal-relative:text;mso-position-vertical:absolute;mso-position-vertical-relative:text;v-text-anchor:middle" o:gfxdata="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" fillcolor="white [3212]" strokecolor="white [3212]" strokeweight="1pt"/>
-            </w:pict>
-          </mc:Fallback>
-        </mc:AlternateContent>
-      </w:r>
-      <w:r>
+          <w:lang w:val="en-US"/>
+        </w:rPr>
+        <w:t>Wazuh</w:t>
+      </w:r>
+      <w:r>
+        <w:t xml:space="preserve"> предоставляет возможность централизованного сбора и анализа </w:t>
+      </w:r>
+      <w:r>
+        <w:t>событий</w:t>
+      </w:r>
+      <w:r>
+        <w:t xml:space="preserve">, а также мониторинга активности пользователей. Благодаря своей масштабируемости и гибкости, </w:t>
+      </w:r>
+      <w:r>
+        <w:rPr>
+          <w:lang w:val="en-US"/>
+        </w:rPr>
+        <w:t>Wazuh</w:t>
+      </w:r>
+      <w:r>
+        <w:t xml:space="preserve"> может быть легко интегрирована с другими системами безопасности и обеспечивать комплексную защиту информационных ресурсов.</w:t>
+      </w:r>
+    </w:p>
+    <w:p>
+      <w:r>
+        <w:t xml:space="preserve">Основными преимуществами </w:t>
+      </w:r>
+      <w:r>
+        <w:rPr>
+          <w:lang w:val="en-US"/>
+        </w:rPr>
+        <w:t>SIEM</w:t>
+      </w:r>
+      <w:r>
+        <w:t xml:space="preserve"> </w:t>
+      </w:r>
+      <w:r>
+        <w:rPr>
+          <w:lang w:val="en-US"/>
+        </w:rPr>
+        <w:t>Wazuh</w:t>
+      </w:r>
+      <w:r>
+        <w:t xml:space="preserve"> являются:</w:t>
+      </w:r>
+    </w:p>
+    <w:p>
+      <w:pPr>
+        <w:pStyle w:val="a9"/>
+        <w:numPr>
+          <w:ilvl w:val="0"/>
+          <w:numId w:val="1"/>
+        </w:numPr>
+        <w:spacing w:after="0"/>
+      </w:pPr>
+      <w:r>
+        <w:t>Реагирование</w:t>
+      </w:r>
+      <w:r>
+        <w:t xml:space="preserve"> на угрозы</w:t>
+      </w:r>
+      <w:r>
+        <w:t xml:space="preserve"> в реальном времени;</w:t>
+      </w:r>
+    </w:p>
+    <w:p>
+      <w:pPr>
+        <w:pStyle w:val="a9"/>
+        <w:numPr>
+          <w:ilvl w:val="0"/>
+          <w:numId w:val="1"/>
+        </w:numPr>
+        <w:spacing w:after="0"/>
+      </w:pPr>
+      <w:r>
+        <w:t>Централизованный мониторинг и анализ безопасности</w:t>
+      </w:r>
+      <w:r>
+        <w:t>;</w:t>
+      </w:r>
+    </w:p>
+    <w:p>
+      <w:pPr>
+        <w:pStyle w:val="a9"/>
+        <w:numPr>
+          <w:ilvl w:val="0"/>
+          <w:numId w:val="1"/>
+        </w:numPr>
+        <w:spacing w:after="0"/>
+      </w:pPr>
+      <w:r>
+        <w:t>Глубокий анализ логов и обнаружение нестандартных событий</w:t>
+      </w:r>
+      <w:r>
+        <w:t>;</w:t>
+      </w:r>
+    </w:p>
+    <w:p>
+      <w:pPr>
+        <w:pStyle w:val="a9"/>
+        <w:numPr>
+          <w:ilvl w:val="0"/>
+          <w:numId w:val="1"/>
+        </w:numPr>
+        <w:spacing w:after="0"/>
+      </w:pPr>
+      <w:r>
+        <w:t>Интеграция с другими системами безопасности</w:t>
+      </w:r>
+      <w:r>
+        <w:t>;</w:t>
+      </w:r>
+    </w:p>
+    <w:p>
+      <w:pPr>
+        <w:pStyle w:val="a9"/>
+        <w:numPr>
+          <w:ilvl w:val="0"/>
+          <w:numId w:val="1"/>
+        </w:numPr>
+        <w:spacing w:after="0"/>
+      </w:pPr>
+      <w:r>
+        <w:t>Поддержка различных типов устройств и операционных систем</w:t>
+      </w:r>
+      <w:r>
+        <w:t>.</w:t>
+      </w:r>
+    </w:p>
+    <w:p>
+      <w:r>
+        <w:t xml:space="preserve">Как и любая система обеспечивающая безопасность сети организации </w:t>
+      </w:r>
+      <w:r>
+        <w:rPr>
+          <w:lang w:val="en-US"/>
+        </w:rPr>
+        <w:t>Wazuh</w:t>
+      </w:r>
+      <w:r>
+        <w:t xml:space="preserve"> </w:t>
+      </w:r>
+      <w:r>
+        <w:t>состоит из двух больших частей: агента и сервера. Первый собирает с системы, на которую он установлен, события из указанных в файле конфигурации, журналов, проводит сканирование системы на уязвимости, проводит проверку целостности файлов системы и другое. Сервер получает данные с агентов, записывает их в базу данных, анализирует и предоставляет их в визуально понятном виде.</w:t>
+      </w:r>
+    </w:p>
+    <w:p>
+      <w:bookmarkStart w:id="0" w:name="_Hlk165804003"/>
+      <w:r>
+        <w:rPr>
+          <w:lang w:val="en-US"/>
+        </w:rPr>
+        <w:t>Wazuh</w:t>
+      </w:r>
+      <w:r>
+        <w:t xml:space="preserve"> </w:t>
+      </w:r>
+      <w:r>
+        <w:rPr>
+          <w:lang w:val="en-US"/>
+        </w:rPr>
+        <w:t>Server</w:t>
+      </w:r>
+      <w:r>
+        <w:t xml:space="preserve"> </w:t>
+      </w:r>
+      <w:r>
+        <w:t>состоит</w:t>
+      </w:r>
+      <w:r>
+        <w:t xml:space="preserve"> </w:t>
+      </w:r>
+      <w:r>
+        <w:t>из</w:t>
+      </w:r>
+      <w:r>
+        <w:t xml:space="preserve"> </w:t>
+      </w:r>
+      <w:r>
+        <w:t>трех</w:t>
+      </w:r>
+      <w:r>
+        <w:t xml:space="preserve"> </w:t>
+      </w:r>
+      <w:r>
+        <w:t>компонентов</w:t>
+      </w:r>
+      <w:r>
+        <w:t xml:space="preserve">: </w:t>
+      </w:r>
+      <w:r>
+        <w:rPr>
+          <w:lang w:val="en-US"/>
+        </w:rPr>
+        <w:t>Wazuh</w:t>
+      </w:r>
+      <w:r>
+        <w:t xml:space="preserve"> </w:t>
+      </w:r>
+      <w:r>
+        <w:rPr>
+          <w:lang w:val="en-US"/>
+        </w:rPr>
+        <w:t>Manager</w:t>
+      </w:r>
+      <w:r>
+        <w:t xml:space="preserve">, </w:t>
+      </w:r>
+      <w:r>
+        <w:rPr>
+          <w:lang w:val="en-US"/>
+        </w:rPr>
+        <w:t>Wazuh</w:t>
+      </w:r>
+      <w:r>
+        <w:t xml:space="preserve"> </w:t>
+      </w:r>
+      <w:r>
+        <w:rPr>
+          <w:lang w:val="en-US"/>
+        </w:rPr>
+        <w:t>Indexer</w:t>
+      </w:r>
+      <w:r>
+        <w:t xml:space="preserve">, </w:t>
+      </w:r>
+      <w:r>
+        <w:rPr>
+          <w:lang w:val="en-US"/>
+        </w:rPr>
+        <w:t>Wazuh</w:t>
+      </w:r>
+      <w:r>
+        <w:t xml:space="preserve"> </w:t>
+      </w:r>
+      <w:r>
+        <w:rPr>
+          <w:lang w:val="en-US"/>
+        </w:rPr>
+        <w:t>Dashboard</w:t>
+      </w:r>
+      <w:bookmarkEnd w:id="0"/>
+      <w:r>
+        <w:t>.</w:t>
+      </w:r>
+    </w:p>
+    <w:p>
+      <w:r>
+        <w:t xml:space="preserve">Перед установкой </w:t>
+      </w:r>
+      <w:r>
+        <w:rPr>
+          <w:lang w:val="en-US"/>
+        </w:rPr>
+        <w:t>wazuh</w:t>
+      </w:r>
+      <w:r>
+        <w:t xml:space="preserve"> необходимо развернуть виртуальную машину. </w:t>
+      </w:r>
+      <w:r>
+        <w:t xml:space="preserve">Если хотим, чтобы было всё хорошо при общении между виртуальной машиной и устройством, на котором оно запущено, необходимо использовать в качестве второй сети виртуальный адаптер хоста. В нём мы указываем, какой </w:t>
+      </w:r>
+      <w:r>
+        <w:rPr>
+          <w:lang w:val="en-US"/>
+        </w:rPr>
+        <w:t>IP</w:t>
+      </w:r>
+      <w:r>
+        <w:t xml:space="preserve"> адрес и в каком диапазоне необходимо его выбирать.</w:t>
+      </w:r>
+      <w:r>
+        <w:t xml:space="preserve"> Пример адаптера представлен на рисунке 1.</w:t>
+      </w:r>
+    </w:p>
+    <w:p>
+      <w:r>
+        <w:lastRenderedPageBreak/>
         <w:drawing>
-          <wp:inline distT="0" distB="0" distL="0" distR="0" wp14:anchorId="70460C06" wp14:editId="7CCDD3BC">
-            <wp:extent cx="6120765" cy="2463165"/>
-            <wp:effectExtent l="0" t="0" r="0" b="0"/>
-            <wp:docPr id="381889156" name="Рисунок 1"/>
+          <wp:inline distT="0" distB="0" distL="0" distR="0" wp14:anchorId="21306A11" wp14:editId="6FBADF12">
+            <wp:extent cx="6120765" cy="2925445"/>
+            <wp:effectExtent l="0" t="0" r="0" b="8255"/>
+            <wp:docPr id="212351735" name="Рисунок 1"/>
             <wp:cNvGraphicFramePr>
               <a:graphicFrameLocks xmlns:a="http://schemas.openxmlformats.org/drawingml/2006/main" noChangeAspect="1"/>
             </wp:cNvGraphicFramePr>
@@ -93,11 +295,11 @@
               <a:graphicData uri="http://schemas.openxmlformats.org/drawingml/2006/picture">
                 <pic:pic xmlns:pic="http://schemas.openxmlformats.org/drawingml/2006/picture">
                   <pic:nvPicPr>
-                    <pic:cNvPr id="381889156" name=""/>
+                    <pic:cNvPr id="212351735" name=""/>
                     <pic:cNvPicPr/>
                   </pic:nvPicPr>
                   <pic:blipFill>
-                    <a:blip r:embed="rId4"/>
+                    <a:blip r:embed="rId6"/>
                     <a:stretch>
                       <a:fillRect/>
                     </a:stretch>
@@ -105,7 +307,7 @@
                   <pic:spPr>
                     <a:xfrm>
                       <a:off x="0" y="0"/>
-                      <a:ext cx="6120765" cy="2463165"/>
+                      <a:ext cx="6120765" cy="2925445"/>
                     </a:xfrm>
                     <a:prstGeom prst="rect">
                       <a:avLst/>
@@ -118,6 +320,1953 @@
         </w:drawing>
       </w:r>
     </w:p>
+    <w:p>
+      <w:pPr>
+        <w:jc w:val="center"/>
+      </w:pPr>
+      <w:r>
+        <w:t>Рисунок 1 — Список виртуальных сетей хоста</w:t>
+      </w:r>
+    </w:p>
+    <w:p>
+      <w:r>
+        <w:rPr>
+          <w:lang w:val="en-US"/>
+        </w:rPr>
+        <w:t>DHCP</w:t>
+      </w:r>
+      <w:r>
+        <w:t xml:space="preserve"> сервер отключён для того, чтобы </w:t>
+      </w:r>
+      <w:r>
+        <w:rPr>
+          <w:lang w:val="en-US"/>
+        </w:rPr>
+        <w:t>IP</w:t>
+      </w:r>
+      <w:r>
+        <w:t xml:space="preserve"> адреса у виртуальной машины не присваивались самостоятельно, поскольку необходимо будет при установке </w:t>
+      </w:r>
+      <w:r>
+        <w:rPr>
+          <w:lang w:val="en-US"/>
+        </w:rPr>
+        <w:t>wazuh</w:t>
+      </w:r>
+      <w:r>
+        <w:t xml:space="preserve"> прописывать статический </w:t>
+      </w:r>
+      <w:r>
+        <w:rPr>
+          <w:lang w:val="en-US"/>
+        </w:rPr>
+        <w:t>IP</w:t>
+      </w:r>
+      <w:r>
+        <w:t xml:space="preserve"> адрес. В случае, если </w:t>
+      </w:r>
+      <w:r>
+        <w:rPr>
+          <w:lang w:val="en-US"/>
+        </w:rPr>
+        <w:t>DHCP</w:t>
+      </w:r>
+      <w:r>
+        <w:t xml:space="preserve"> сервер включён, </w:t>
+      </w:r>
+      <w:r>
+        <w:rPr>
+          <w:lang w:val="en-US"/>
+        </w:rPr>
+        <w:t>IP</w:t>
+      </w:r>
+      <w:r>
+        <w:t xml:space="preserve"> адрес может быть изменён при перезагрузке виртуальной машины</w:t>
+      </w:r>
+      <w:r>
+        <w:t xml:space="preserve">. </w:t>
+      </w:r>
+      <w:r>
+        <w:t xml:space="preserve">Пример настройки, где </w:t>
+      </w:r>
+      <w:r>
+        <w:rPr>
+          <w:lang w:val="en-US"/>
+        </w:rPr>
+        <w:t>enp</w:t>
+      </w:r>
+      <w:r>
+        <w:t>0</w:t>
+      </w:r>
+      <w:r>
+        <w:rPr>
+          <w:lang w:val="en-US"/>
+        </w:rPr>
+        <w:t>s</w:t>
+      </w:r>
+      <w:r>
+        <w:t>3</w:t>
+      </w:r>
+      <w:r>
+        <w:t xml:space="preserve"> — </w:t>
+      </w:r>
+      <w:r>
+        <w:rPr>
+          <w:lang w:val="en-US"/>
+        </w:rPr>
+        <w:t>NAT</w:t>
+      </w:r>
+      <w:r>
+        <w:t xml:space="preserve"> сеть, а </w:t>
+      </w:r>
+      <w:r>
+        <w:rPr>
+          <w:lang w:val="en-US"/>
+        </w:rPr>
+        <w:t>enp</w:t>
+      </w:r>
+      <w:r>
+        <w:t>0</w:t>
+      </w:r>
+      <w:r>
+        <w:rPr>
+          <w:lang w:val="en-US"/>
+        </w:rPr>
+        <w:t>s</w:t>
+      </w:r>
+      <w:r>
+        <w:t>8 —</w:t>
+      </w:r>
+      <w:r>
+        <w:t xml:space="preserve"> виртуальный хост, представлен на рисунке 2.</w:t>
+      </w:r>
+    </w:p>
+    <w:p>
+      <w:pPr>
+        <w:jc w:val="center"/>
+      </w:pPr>
+      <w:r>
+        <w:drawing>
+          <wp:inline distT="0" distB="0" distL="0" distR="0" wp14:anchorId="20A67FF2" wp14:editId="00268505">
+            <wp:extent cx="4084320" cy="1591949"/>
+            <wp:effectExtent l="0" t="0" r="0" b="8255"/>
+            <wp:docPr id="670897092" name="Рисунок 1"/>
+            <wp:cNvGraphicFramePr>
+              <a:graphicFrameLocks xmlns:a="http://schemas.openxmlformats.org/drawingml/2006/main" noChangeAspect="1"/>
+            </wp:cNvGraphicFramePr>
+            <a:graphic xmlns:a="http://schemas.openxmlformats.org/drawingml/2006/main">
+              <a:graphicData uri="http://schemas.openxmlformats.org/drawingml/2006/picture">
+                <pic:pic xmlns:pic="http://schemas.openxmlformats.org/drawingml/2006/picture">
+                  <pic:nvPicPr>
+                    <pic:cNvPr id="670897092" name=""/>
+                    <pic:cNvPicPr/>
+                  </pic:nvPicPr>
+                  <pic:blipFill>
+                    <a:blip r:embed="rId7"/>
+                    <a:stretch>
+                      <a:fillRect/>
+                    </a:stretch>
+                  </pic:blipFill>
+                  <pic:spPr>
+                    <a:xfrm>
+                      <a:off x="0" y="0"/>
+                      <a:ext cx="4096029" cy="1596513"/>
+                    </a:xfrm>
+                    <a:prstGeom prst="rect">
+                      <a:avLst/>
+                    </a:prstGeom>
+                  </pic:spPr>
+                </pic:pic>
+              </a:graphicData>
+            </a:graphic>
+          </wp:inline>
+        </w:drawing>
+      </w:r>
+    </w:p>
+    <w:p>
+      <w:pPr>
+        <w:jc w:val="center"/>
+      </w:pPr>
+      <w:r>
+        <w:t xml:space="preserve"> </w:t>
+      </w:r>
+      <w:r>
+        <w:t xml:space="preserve">Рисунок </w:t>
+      </w:r>
+      <w:r>
+        <w:t>2</w:t>
+      </w:r>
+      <w:r>
+        <w:t xml:space="preserve"> — </w:t>
+      </w:r>
+      <w:r>
+        <w:t>Настройка сети</w:t>
+      </w:r>
+    </w:p>
+    <w:p>
+      <w:r>
+        <w:t>После этого</w:t>
+      </w:r>
+      <w:r>
+        <w:t xml:space="preserve"> необходимо перезапустить систему, например с помощью команды</w:t>
+      </w:r>
+      <w:r>
+        <w:t xml:space="preserve"> </w:t>
+      </w:r>
+      <w:r>
+        <w:rPr>
+          <w:lang w:val="en-US"/>
+        </w:rPr>
+        <w:t>reboot</w:t>
+      </w:r>
+      <w:r>
+        <w:t>.</w:t>
+      </w:r>
+      <w:r>
+        <w:t xml:space="preserve"> Далее необходимо изменить время, чтобы избежать </w:t>
+      </w:r>
+      <w:r>
+        <w:t>несинхронизированные часы агента и менеджера</w:t>
+      </w:r>
+      <w:r>
+        <w:t xml:space="preserve">. Иначе это может привести к: </w:t>
+      </w:r>
+      <w:r>
+        <w:t xml:space="preserve">задержкам или отсутствию алертов, неверной хронологии событий в Dashboard, </w:t>
+      </w:r>
+      <w:r>
+        <w:lastRenderedPageBreak/>
+        <w:t>проблемам с парсингом логов и ошибкам регистрации агентов.</w:t>
+      </w:r>
+      <w:r>
+        <w:t xml:space="preserve"> </w:t>
+      </w:r>
+      <w:r>
+        <w:t>Меняем время</w:t>
+      </w:r>
+      <w:r>
+        <w:t xml:space="preserve"> с помощью утилиты </w:t>
+      </w:r>
+      <w:r>
+        <w:rPr>
+          <w:lang w:val="en-US"/>
+        </w:rPr>
+        <w:t>timedatactl</w:t>
+      </w:r>
+      <w:r>
+        <w:t xml:space="preserve">. </w:t>
+      </w:r>
+      <w:r>
+        <w:t xml:space="preserve">Предварительно устанавливаем </w:t>
+      </w:r>
+      <w:r>
+        <w:rPr>
+          <w:lang w:val="en-US"/>
+        </w:rPr>
+        <w:t>dbus</w:t>
+      </w:r>
+      <w:r>
+        <w:t>. Результат можно увидеть на рисунке 3.</w:t>
+      </w:r>
+    </w:p>
+    <w:p>
+      <w:pPr>
+        <w:jc w:val="center"/>
+      </w:pPr>
+      <w:r>
+        <w:rPr>
+          <w:noProof/>
+        </w:rPr>
+        <w:drawing>
+          <wp:inline distT="0" distB="0" distL="0" distR="0" wp14:anchorId="0DB8613C" wp14:editId="7576EA00">
+            <wp:extent cx="5430008" cy="1143160"/>
+            <wp:effectExtent l="0" t="0" r="0" b="0"/>
+            <wp:docPr id="445395969" name="Рисунок 1"/>
+            <wp:cNvGraphicFramePr>
+              <a:graphicFrameLocks xmlns:a="http://schemas.openxmlformats.org/drawingml/2006/main" noChangeAspect="1"/>
+            </wp:cNvGraphicFramePr>
+            <a:graphic xmlns:a="http://schemas.openxmlformats.org/drawingml/2006/main">
+              <a:graphicData uri="http://schemas.openxmlformats.org/drawingml/2006/picture">
+                <pic:pic xmlns:pic="http://schemas.openxmlformats.org/drawingml/2006/picture">
+                  <pic:nvPicPr>
+                    <pic:cNvPr id="445395969" name=""/>
+                    <pic:cNvPicPr/>
+                  </pic:nvPicPr>
+                  <pic:blipFill>
+                    <a:blip r:embed="rId8"/>
+                    <a:stretch>
+                      <a:fillRect/>
+                    </a:stretch>
+                  </pic:blipFill>
+                  <pic:spPr>
+                    <a:xfrm>
+                      <a:off x="0" y="0"/>
+                      <a:ext cx="5430008" cy="1143160"/>
+                    </a:xfrm>
+                    <a:prstGeom prst="rect">
+                      <a:avLst/>
+                    </a:prstGeom>
+                  </pic:spPr>
+                </pic:pic>
+              </a:graphicData>
+            </a:graphic>
+          </wp:inline>
+        </w:drawing>
+      </w:r>
+    </w:p>
+    <w:p>
+      <w:pPr>
+        <w:jc w:val="center"/>
+      </w:pPr>
+      <w:r>
+        <w:t>Рисунок 3 — изменение времени на виртуальной машине</w:t>
+      </w:r>
+    </w:p>
+    <w:p>
+      <w:r>
+        <w:t xml:space="preserve">Далее выполняем установку необходимых компонентов для работы системы. </w:t>
+      </w:r>
+    </w:p>
+    <w:p>
+      <w:pPr>
+        <w:rPr>
+          <w:sz w:val="24"/>
+        </w:rPr>
+      </w:pPr>
+      <w:bookmarkStart w:id="1" w:name="_Hlk165804059"/>
+      <w:r>
+        <w:t>Индексатор Wazuh — это система полнотекстового поиска и анализа данных безопасности, работающая в режиме реального времени.</w:t>
+      </w:r>
+      <w:bookmarkEnd w:id="1"/>
+      <w:r>
+        <w:t xml:space="preserve"> Данные журналов, поступающие на сервер Wazuh, анализируются и передаются индексатору для индексации и хранения. Эти события затем запрашиваются на панели управления Wazuh.</w:t>
+      </w:r>
+    </w:p>
+    <w:p>
+      <w:r>
+        <w:t>Индексатор Wazuh хранит данные в виде документов JSON. Каждый документ связывает набор ключей, имен полей или атрибутов с соответствующими значениями, которые могут быть символами, числами, логическими значениями, датами, массивами значений, геолокацией или другими типами данных.</w:t>
+      </w:r>
+    </w:p>
+    <w:p>
+      <w:r>
+        <w:t>Индексатор Wazuh можно настроить как кластер с одним или несколькими узлами, что обеспечивает масштабируемость и высокую доступность. Он распределяет документы по разным контейнерам, называемые осколкам. В свою очередь, он распределяет эти осколки по узлам кластера. Распределяя документы по нескольким сегментам и распределяя эти сегменты по нескольким узлам, индексатор Wazuh обеспечивает избыточность. Избыточность обеспечивает доступность индексатора Wazuh в случае сбоя и увеличивает пропускную способность запросов на узлах кластера.</w:t>
+      </w:r>
+      <w:r>
+        <w:t xml:space="preserve"> Для установки, согласно документации, необходимо скачать установочный скрипт и конфигурационный файл. Сам </w:t>
+      </w:r>
+      <w:r>
+        <w:lastRenderedPageBreak/>
+        <w:t>конфигурационный файл</w:t>
+      </w:r>
+      <w:r>
+        <w:t xml:space="preserve"> необходимо изменить</w:t>
+      </w:r>
+      <w:r>
+        <w:t>, вписав в него статический адрес, который был настроен до этого.</w:t>
+      </w:r>
+      <w:r>
+        <w:t xml:space="preserve"> </w:t>
+      </w:r>
+    </w:p>
+    <w:p>
+      <w:r>
+        <w:t>После этого мы запускаем скрипт следующей командой:</w:t>
+      </w:r>
+    </w:p>
+    <w:p>
+      <w:r>
+        <w:rPr>
+          <w:lang w:val="en-US"/>
+        </w:rPr>
+        <w:t>bash wazuh-install.sh --generate-config-files</w:t>
+      </w:r>
+    </w:p>
+    <w:p>
+      <w:pPr>
+        <w:rPr>
+          <w:lang w:val="en-US"/>
+        </w:rPr>
+      </w:pPr>
+      <w:r>
+        <w:t xml:space="preserve">Конфигурационный файл применяется и удаляется. После этого нам достаточно ввести следующую команду для установки </w:t>
+      </w:r>
+      <w:r>
+        <w:rPr>
+          <w:lang w:val="en-US"/>
+        </w:rPr>
+        <w:t>indexer</w:t>
+      </w:r>
+    </w:p>
+    <w:p>
+      <w:pPr>
+        <w:rPr>
+          <w:lang w:val="en-US"/>
+        </w:rPr>
+      </w:pPr>
+      <w:r>
+        <w:rPr>
+          <w:lang w:val="en-US"/>
+        </w:rPr>
+        <w:t>bash wazuh-install.sh --wazuh-indexer node-1</w:t>
+      </w:r>
+    </w:p>
+    <w:p>
+      <w:hyperlink r:id="rId9" w:history="1">
+        <w:r>
+          <w:rPr>
+            <w:rStyle w:val="af"/>
+            <w:lang w:val="en-US"/>
+          </w:rPr>
+          <w:t>https</w:t>
+        </w:r>
+        <w:r>
+          <w:rPr>
+            <w:rStyle w:val="af"/>
+          </w:rPr>
+          <w:t>://</w:t>
+        </w:r>
+        <w:r>
+          <w:rPr>
+            <w:rStyle w:val="af"/>
+            <w:lang w:val="en-US"/>
+          </w:rPr>
+          <w:t>docume</w:t>
+        </w:r>
+        <w:r>
+          <w:rPr>
+            <w:rStyle w:val="af"/>
+            <w:lang w:val="en-US"/>
+          </w:rPr>
+          <w:t>n</w:t>
+        </w:r>
+        <w:r>
+          <w:rPr>
+            <w:rStyle w:val="af"/>
+            <w:lang w:val="en-US"/>
+          </w:rPr>
+          <w:t>tation</w:t>
+        </w:r>
+        <w:r>
+          <w:rPr>
+            <w:rStyle w:val="af"/>
+          </w:rPr>
+          <w:t>.</w:t>
+        </w:r>
+        <w:r>
+          <w:rPr>
+            <w:rStyle w:val="af"/>
+            <w:lang w:val="en-US"/>
+          </w:rPr>
+          <w:t>wazuh</w:t>
+        </w:r>
+        <w:r>
+          <w:rPr>
+            <w:rStyle w:val="af"/>
+          </w:rPr>
+          <w:t>.</w:t>
+        </w:r>
+        <w:r>
+          <w:rPr>
+            <w:rStyle w:val="af"/>
+            <w:lang w:val="en-US"/>
+          </w:rPr>
+          <w:t>com</w:t>
+        </w:r>
+        <w:r>
+          <w:rPr>
+            <w:rStyle w:val="af"/>
+          </w:rPr>
+          <w:t>/</w:t>
+        </w:r>
+        <w:r>
+          <w:rPr>
+            <w:rStyle w:val="af"/>
+            <w:lang w:val="en-US"/>
+          </w:rPr>
+          <w:t>current</w:t>
+        </w:r>
+        <w:r>
+          <w:rPr>
+            <w:rStyle w:val="af"/>
+          </w:rPr>
+          <w:t>/</w:t>
+        </w:r>
+        <w:r>
+          <w:rPr>
+            <w:rStyle w:val="af"/>
+            <w:lang w:val="en-US"/>
+          </w:rPr>
+          <w:t>installation</w:t>
+        </w:r>
+        <w:r>
+          <w:rPr>
+            <w:rStyle w:val="af"/>
+          </w:rPr>
+          <w:t>-</w:t>
+        </w:r>
+        <w:r>
+          <w:rPr>
+            <w:rStyle w:val="af"/>
+            <w:lang w:val="en-US"/>
+          </w:rPr>
+          <w:t>guide</w:t>
+        </w:r>
+        <w:r>
+          <w:rPr>
+            <w:rStyle w:val="af"/>
+          </w:rPr>
+          <w:t>/</w:t>
+        </w:r>
+        <w:r>
+          <w:rPr>
+            <w:rStyle w:val="af"/>
+            <w:lang w:val="en-US"/>
+          </w:rPr>
+          <w:t>wazuh</w:t>
+        </w:r>
+        <w:r>
+          <w:rPr>
+            <w:rStyle w:val="af"/>
+          </w:rPr>
+          <w:t>-</w:t>
+        </w:r>
+        <w:r>
+          <w:rPr>
+            <w:rStyle w:val="af"/>
+            <w:lang w:val="en-US"/>
+          </w:rPr>
+          <w:t>indexer</w:t>
+        </w:r>
+        <w:r>
+          <w:rPr>
+            <w:rStyle w:val="af"/>
+          </w:rPr>
+          <w:t>/</w:t>
+        </w:r>
+        <w:r>
+          <w:rPr>
+            <w:rStyle w:val="af"/>
+            <w:lang w:val="en-US"/>
+          </w:rPr>
+          <w:t>installation</w:t>
+        </w:r>
+        <w:r>
+          <w:rPr>
+            <w:rStyle w:val="af"/>
+          </w:rPr>
+          <w:t>-</w:t>
+        </w:r>
+        <w:r>
+          <w:rPr>
+            <w:rStyle w:val="af"/>
+            <w:lang w:val="en-US"/>
+          </w:rPr>
+          <w:t>assistant</w:t>
+        </w:r>
+        <w:r>
+          <w:rPr>
+            <w:rStyle w:val="af"/>
+          </w:rPr>
+          <w:t>.</w:t>
+        </w:r>
+        <w:r>
+          <w:rPr>
+            <w:rStyle w:val="af"/>
+            <w:lang w:val="en-US"/>
+          </w:rPr>
+          <w:t>html</w:t>
+        </w:r>
+      </w:hyperlink>
+    </w:p>
+    <w:p>
+      <w:r>
+        <w:t xml:space="preserve">Далее переходим к установке </w:t>
+      </w:r>
+      <w:r>
+        <w:rPr>
+          <w:lang w:val="en-US"/>
+        </w:rPr>
+        <w:t>Wazuh</w:t>
+      </w:r>
+      <w:r>
+        <w:t xml:space="preserve"> </w:t>
+      </w:r>
+      <w:r>
+        <w:rPr>
+          <w:lang w:val="en-US"/>
+        </w:rPr>
+        <w:t>Manager</w:t>
+      </w:r>
+      <w:r>
+        <w:t xml:space="preserve">. </w:t>
+      </w:r>
+    </w:p>
+    <w:p>
+      <w:bookmarkStart w:id="2" w:name="_Hlk165804046"/>
+      <w:r>
+        <w:rPr>
+          <w:lang w:val="en-US"/>
+        </w:rPr>
+        <w:t>Wazuh</w:t>
+      </w:r>
+      <w:r>
+        <w:t xml:space="preserve"> </w:t>
+      </w:r>
+      <w:r>
+        <w:rPr>
+          <w:lang w:val="en-US"/>
+        </w:rPr>
+        <w:t>Manager</w:t>
+      </w:r>
+      <w:r>
+        <w:t xml:space="preserve"> - </w:t>
+      </w:r>
+      <w:r>
+        <w:t>это система, которая анализирует данные, полученные от всех зарегистрированных агентов, и выдает оповещения, когда событие совпадает с правилом.</w:t>
+      </w:r>
+      <w:bookmarkEnd w:id="2"/>
+      <w:r>
+        <w:t xml:space="preserve"> Например, обнаружено вторжение, изменен файл, конфигурация не соответствует политике, возможный руткит и т. д. Менеджер также работает как агент на локальной машине, а это значит, что он обладает всеми функциями, которыми обладает агент. Кроме того, менеджер имеет возможность пересылать инициируемые им оповещения через системный журнал, электронную почту или интегрированные внешние API.</w:t>
+      </w:r>
+    </w:p>
+    <w:p>
+      <w:r>
+        <w:rPr>
+          <w:lang w:val="en-US"/>
+        </w:rPr>
+        <w:t>Wazuh</w:t>
+      </w:r>
+      <w:r>
+        <w:t xml:space="preserve"> </w:t>
+      </w:r>
+      <w:r>
+        <w:rPr>
+          <w:lang w:val="en-US"/>
+        </w:rPr>
+        <w:t>Manager</w:t>
+      </w:r>
+      <w:r>
+        <w:t xml:space="preserve"> </w:t>
+      </w:r>
+      <w:r>
+        <w:t>позволяет хранить в себе журналы, оповещения и другие данные, связанные с безопасностью, собранные с контролируемых конечных точек. При том все они находятся в архивах. Там хранятся все события, полученные сервером Wazuh, независимо от того, нарушают ли они правило или нет. Архивы Wazuh полезны для поиска угроз, поскольку команды безопасности могут использовать архивные журналы для просмотра данных об инцидентах безопасности, анализа тенденций и создания отчетов.</w:t>
+      </w:r>
+    </w:p>
+    <w:p>
+      <w:bookmarkStart w:id="3" w:name="_Hlk165811661"/>
+      <w:r>
+        <w:lastRenderedPageBreak/>
+        <w:t>Каждое событие, собранное агентом Wazuh, передается менеджеру Wazuh. Менеджер присвоит событию уровень серьезности в зависимости от того, каким правилам из набора оно соответствует. По умолчанию он регистрирует только на оповещения с уровнем опасности 3 или выше.</w:t>
+      </w:r>
+    </w:p>
+    <w:p>
+      <w:r>
+        <w:t xml:space="preserve">Каждое событие, которое получает сервер имеет свой уровень опасности от 0 до 16. При том, уровень ниже 3 не отображается. </w:t>
+      </w:r>
+    </w:p>
+    <w:p>
+      <w:bookmarkStart w:id="4" w:name="_Hlk165865148"/>
+      <w:r>
+        <w:t>Оценка происходит по регулярным выражениям указанными в каждом правиле. При том каждое правило имеет родительское правило и будет выполняться в случае, если родительское правило было истинно.</w:t>
+      </w:r>
+    </w:p>
+    <w:bookmarkEnd w:id="3"/>
+    <w:bookmarkEnd w:id="4"/>
+    <w:p>
+      <w:r>
+        <w:t xml:space="preserve">Файлы правил лежат на сервере в папке </w:t>
+      </w:r>
+      <w:r>
+        <w:t>/var/ossec/ruleset/rules</w:t>
+      </w:r>
+      <w:r>
+        <w:t xml:space="preserve">. Есть родительские правила, которые указывают на тип события. То есть условных групп событий 7: </w:t>
+      </w:r>
+    </w:p>
+    <w:p>
+      <w:pPr>
+        <w:pStyle w:val="a9"/>
+        <w:numPr>
+          <w:ilvl w:val="0"/>
+          <w:numId w:val="2"/>
+        </w:numPr>
+        <w:spacing w:after="0"/>
+      </w:pPr>
+      <w:r>
+        <w:t>В</w:t>
+      </w:r>
+      <w:r>
+        <w:t>се правил</w:t>
+      </w:r>
+      <w:r>
+        <w:t>а</w:t>
+      </w:r>
+      <w:r>
+        <w:t xml:space="preserve"> системного журнала</w:t>
+      </w:r>
+      <w:r>
+        <w:t>;</w:t>
+      </w:r>
+    </w:p>
+    <w:p>
+      <w:pPr>
+        <w:pStyle w:val="a9"/>
+        <w:numPr>
+          <w:ilvl w:val="0"/>
+          <w:numId w:val="2"/>
+        </w:numPr>
+        <w:spacing w:after="0"/>
+      </w:pPr>
+      <w:r>
+        <w:t>В</w:t>
+      </w:r>
+      <w:r>
+        <w:t>се правил</w:t>
+      </w:r>
+      <w:r>
+        <w:t>а</w:t>
+      </w:r>
+      <w:r>
+        <w:t xml:space="preserve"> брандмауэра</w:t>
+      </w:r>
+      <w:r>
+        <w:t>;</w:t>
+      </w:r>
+    </w:p>
+    <w:p>
+      <w:pPr>
+        <w:pStyle w:val="a9"/>
+        <w:numPr>
+          <w:ilvl w:val="0"/>
+          <w:numId w:val="2"/>
+        </w:numPr>
+        <w:spacing w:after="0"/>
+      </w:pPr>
+      <w:r>
+        <w:t>В</w:t>
+      </w:r>
+      <w:r>
+        <w:t>се правил</w:t>
+      </w:r>
+      <w:r>
+        <w:t>а</w:t>
+      </w:r>
+      <w:r>
+        <w:t xml:space="preserve"> идентификации</w:t>
+      </w:r>
+      <w:r>
+        <w:t>;</w:t>
+      </w:r>
+    </w:p>
+    <w:p>
+      <w:pPr>
+        <w:pStyle w:val="a9"/>
+        <w:numPr>
+          <w:ilvl w:val="0"/>
+          <w:numId w:val="2"/>
+        </w:numPr>
+        <w:spacing w:after="0"/>
+      </w:pPr>
+      <w:r>
+        <w:t>В</w:t>
+      </w:r>
+      <w:r>
+        <w:t>се веб-правил</w:t>
+      </w:r>
+      <w:r>
+        <w:t>а;</w:t>
+      </w:r>
+    </w:p>
+    <w:p>
+      <w:pPr>
+        <w:pStyle w:val="a9"/>
+        <w:numPr>
+          <w:ilvl w:val="0"/>
+          <w:numId w:val="2"/>
+        </w:numPr>
+        <w:spacing w:after="0"/>
+      </w:pPr>
+      <w:r>
+        <w:t>В</w:t>
+      </w:r>
+      <w:r>
+        <w:t>се правил</w:t>
+      </w:r>
+      <w:r>
+        <w:t>а</w:t>
+      </w:r>
+      <w:r>
+        <w:t xml:space="preserve"> веб-прокси</w:t>
+      </w:r>
+      <w:r>
+        <w:t>;</w:t>
+      </w:r>
+    </w:p>
+    <w:p>
+      <w:pPr>
+        <w:pStyle w:val="a9"/>
+        <w:numPr>
+          <w:ilvl w:val="0"/>
+          <w:numId w:val="2"/>
+        </w:numPr>
+        <w:spacing w:after="0"/>
+      </w:pPr>
+      <w:r>
+        <w:t>В</w:t>
+      </w:r>
+      <w:r>
+        <w:t>се правил</w:t>
+      </w:r>
+      <w:r>
+        <w:t>а</w:t>
+      </w:r>
+      <w:r>
+        <w:t xml:space="preserve"> Windows</w:t>
+      </w:r>
+      <w:r>
+        <w:t>;</w:t>
+      </w:r>
+    </w:p>
+    <w:p>
+      <w:pPr>
+        <w:pStyle w:val="a9"/>
+        <w:numPr>
+          <w:ilvl w:val="0"/>
+          <w:numId w:val="2"/>
+        </w:numPr>
+        <w:spacing w:after="0"/>
+      </w:pPr>
+      <w:r>
+        <w:t>В</w:t>
+      </w:r>
+      <w:r>
+        <w:t>се правил</w:t>
+      </w:r>
+      <w:r>
+        <w:t>а</w:t>
+      </w:r>
+      <w:r>
+        <w:t xml:space="preserve"> </w:t>
+      </w:r>
+      <w:r>
+        <w:rPr>
+          <w:lang w:val="en-US"/>
+        </w:rPr>
+        <w:t>W</w:t>
+      </w:r>
+      <w:r>
+        <w:t>azuh.</w:t>
+      </w:r>
+    </w:p>
+    <w:p>
+      <w:pPr>
+        <w:spacing w:after="0"/>
+      </w:pPr>
+      <w:r>
+        <w:t>Установка происходит по тому же шаблону:</w:t>
+      </w:r>
+    </w:p>
+    <w:p>
+      <w:pPr>
+        <w:spacing w:after="0"/>
+      </w:pPr>
+      <w:r>
+        <w:rPr>
+          <w:lang w:val="en-US"/>
+        </w:rPr>
+        <w:t>bash wazuh-install.sh --wazuh-server wazuh-1</w:t>
+      </w:r>
+    </w:p>
+    <w:p>
+      <w:pPr>
+        <w:spacing w:after="0"/>
+      </w:pPr>
+      <w:r>
+        <w:t xml:space="preserve">Также будет не лишним отключить автообновление </w:t>
+      </w:r>
+      <w:r>
+        <w:rPr>
+          <w:lang w:val="en-US"/>
+        </w:rPr>
+        <w:t>wazuh</w:t>
+      </w:r>
+      <w:r>
+        <w:t>-</w:t>
+      </w:r>
+      <w:r>
+        <w:rPr>
+          <w:lang w:val="en-US"/>
+        </w:rPr>
+        <w:t>manager</w:t>
+      </w:r>
+      <w:r>
+        <w:t xml:space="preserve">, </w:t>
+      </w:r>
+      <w:r>
+        <w:t>чтобы выполнять это действие самостоятельно, поскольку это может привести к конфликту версий.</w:t>
+      </w:r>
+    </w:p>
+    <w:p>
+      <w:pPr>
+        <w:spacing w:after="0"/>
+        <w:rPr>
+          <w:lang w:val="en-US"/>
+        </w:rPr>
+      </w:pPr>
+      <w:r>
+        <w:rPr>
+          <w:lang w:val="en-US"/>
+        </w:rPr>
+        <w:t>sed -i "s/^deb /#deb /" /etc/apt/sources.list.d/wazuh.list</w:t>
+      </w:r>
+    </w:p>
+    <w:p>
+      <w:pPr>
+        <w:spacing w:after="0"/>
+      </w:pPr>
+      <w:r>
+        <w:t>apt update</w:t>
+      </w:r>
+    </w:p>
+    <w:p>
+      <w:hyperlink r:id="rId10" w:history="1">
+        <w:r>
+          <w:rPr>
+            <w:rStyle w:val="af"/>
+            <w:lang w:val="en-US"/>
+          </w:rPr>
+          <w:t>https</w:t>
+        </w:r>
+        <w:r>
+          <w:rPr>
+            <w:rStyle w:val="af"/>
+          </w:rPr>
+          <w:t>://</w:t>
+        </w:r>
+        <w:r>
+          <w:rPr>
+            <w:rStyle w:val="af"/>
+            <w:lang w:val="en-US"/>
+          </w:rPr>
+          <w:t>documentation</w:t>
+        </w:r>
+        <w:r>
+          <w:rPr>
+            <w:rStyle w:val="af"/>
+          </w:rPr>
+          <w:t>.</w:t>
+        </w:r>
+        <w:r>
+          <w:rPr>
+            <w:rStyle w:val="af"/>
+            <w:lang w:val="en-US"/>
+          </w:rPr>
+          <w:t>wazuh</w:t>
+        </w:r>
+        <w:r>
+          <w:rPr>
+            <w:rStyle w:val="af"/>
+          </w:rPr>
+          <w:t>.</w:t>
+        </w:r>
+        <w:r>
+          <w:rPr>
+            <w:rStyle w:val="af"/>
+            <w:lang w:val="en-US"/>
+          </w:rPr>
+          <w:t>com</w:t>
+        </w:r>
+        <w:r>
+          <w:rPr>
+            <w:rStyle w:val="af"/>
+          </w:rPr>
+          <w:t>/</w:t>
+        </w:r>
+        <w:r>
+          <w:rPr>
+            <w:rStyle w:val="af"/>
+            <w:lang w:val="en-US"/>
+          </w:rPr>
+          <w:t>current</w:t>
+        </w:r>
+        <w:r>
+          <w:rPr>
+            <w:rStyle w:val="af"/>
+          </w:rPr>
+          <w:t>/</w:t>
+        </w:r>
+        <w:r>
+          <w:rPr>
+            <w:rStyle w:val="af"/>
+            <w:lang w:val="en-US"/>
+          </w:rPr>
+          <w:t>installation</w:t>
+        </w:r>
+        <w:r>
+          <w:rPr>
+            <w:rStyle w:val="af"/>
+          </w:rPr>
+          <w:t>-</w:t>
+        </w:r>
+        <w:r>
+          <w:rPr>
+            <w:rStyle w:val="af"/>
+            <w:lang w:val="en-US"/>
+          </w:rPr>
+          <w:t>guide</w:t>
+        </w:r>
+        <w:r>
+          <w:rPr>
+            <w:rStyle w:val="af"/>
+          </w:rPr>
+          <w:t>/</w:t>
+        </w:r>
+        <w:r>
+          <w:rPr>
+            <w:rStyle w:val="af"/>
+            <w:lang w:val="en-US"/>
+          </w:rPr>
+          <w:t>wazuh</w:t>
+        </w:r>
+        <w:r>
+          <w:rPr>
+            <w:rStyle w:val="af"/>
+          </w:rPr>
+          <w:t>-</w:t>
+        </w:r>
+        <w:r>
+          <w:rPr>
+            <w:rStyle w:val="af"/>
+            <w:lang w:val="en-US"/>
+          </w:rPr>
+          <w:t>server</w:t>
+        </w:r>
+        <w:r>
+          <w:rPr>
+            <w:rStyle w:val="af"/>
+          </w:rPr>
+          <w:t>/</w:t>
+        </w:r>
+        <w:r>
+          <w:rPr>
+            <w:rStyle w:val="af"/>
+            <w:lang w:val="en-US"/>
+          </w:rPr>
+          <w:t>installation</w:t>
+        </w:r>
+        <w:r>
+          <w:rPr>
+            <w:rStyle w:val="af"/>
+          </w:rPr>
+          <w:t>-</w:t>
+        </w:r>
+        <w:r>
+          <w:rPr>
+            <w:rStyle w:val="af"/>
+            <w:lang w:val="en-US"/>
+          </w:rPr>
+          <w:t>assistant</w:t>
+        </w:r>
+        <w:r>
+          <w:rPr>
+            <w:rStyle w:val="af"/>
+          </w:rPr>
+          <w:t>.</w:t>
+        </w:r>
+        <w:r>
+          <w:rPr>
+            <w:rStyle w:val="af"/>
+            <w:lang w:val="en-US"/>
+          </w:rPr>
+          <w:t>html</w:t>
+        </w:r>
+      </w:hyperlink>
+      <w:r>
+        <w:t xml:space="preserve"> </w:t>
+      </w:r>
+    </w:p>
+    <w:p>
+      <w:bookmarkStart w:id="5" w:name="_Hlk165804071"/>
+      <w:r>
+        <w:lastRenderedPageBreak/>
+        <w:t xml:space="preserve">Далее устанавливается </w:t>
+      </w:r>
+      <w:r>
+        <w:rPr>
+          <w:lang w:val="en-US"/>
+        </w:rPr>
+        <w:t>Dashboard</w:t>
+      </w:r>
+      <w:r>
+        <w:t xml:space="preserve"> </w:t>
+      </w:r>
+      <w:r>
+        <w:rPr>
+          <w:lang w:val="en-US"/>
+        </w:rPr>
+        <w:t>Wazuh</w:t>
+      </w:r>
+      <w:r>
+        <w:t xml:space="preserve">. </w:t>
+      </w:r>
+      <w:r>
+        <w:t xml:space="preserve">Панель инструментов Wazuh — это веб-интерфейс пользователя для визуализации и анализа данных. </w:t>
+      </w:r>
+      <w:bookmarkEnd w:id="5"/>
+      <w:r>
+        <w:t>Он включает в себя готовые информационные панели для событий безопасности, соответствия нормативным требованиям (например, PCI DSS, GDPR, CIS, HIPAA, NIST 800-53), обнаруженных уязвимых приложений, данных мониторинга целостности файлов, результатов оценки конфигурации, мониторинга облачной инфраструктуры. мероприятия и другие. Он также используется для управления конфигурацией Wazuh и мониторинга ее состояния.</w:t>
+      </w:r>
+    </w:p>
+    <w:p>
+      <w:r>
+        <w:t xml:space="preserve">Команда для установки </w:t>
+      </w:r>
+    </w:p>
+    <w:p>
+      <w:r>
+        <w:rPr>
+          <w:lang w:val="en-US"/>
+        </w:rPr>
+        <w:t>bash wazuh-install.sh --wazuh-dashboard dashboard</w:t>
+      </w:r>
+    </w:p>
+    <w:p>
+      <w:r>
+        <w:t>После этого мы получаем логин и пароль для аутентификации в системе. Переходим</w:t>
+      </w:r>
+      <w:r>
+        <w:t xml:space="preserve"> </w:t>
+      </w:r>
+      <w:r>
+        <w:t>по</w:t>
+      </w:r>
+      <w:r>
+        <w:t xml:space="preserve"> </w:t>
+      </w:r>
+      <w:r>
+        <w:t>ссылке</w:t>
+      </w:r>
+      <w:r>
+        <w:t xml:space="preserve"> </w:t>
+      </w:r>
+      <w:hyperlink r:id="rId11" w:history="1">
+        <w:r>
+          <w:rPr>
+            <w:rStyle w:val="af"/>
+            <w:lang w:val="en-US"/>
+          </w:rPr>
+          <w:t>https</w:t>
+        </w:r>
+        <w:r>
+          <w:rPr>
+            <w:rStyle w:val="af"/>
+          </w:rPr>
+          <w:t>://192.168.56.3/</w:t>
+        </w:r>
+      </w:hyperlink>
+      <w:r>
+        <w:t xml:space="preserve"> и видим окно аутентификации. Вводим полученные значения и переходим на главную страницу </w:t>
+      </w:r>
+      <w:r>
+        <w:rPr>
+          <w:lang w:val="en-US"/>
+        </w:rPr>
+        <w:t>dashboard</w:t>
+      </w:r>
+      <w:r>
+        <w:t>, как это продемонстрировано на рисунке 4.</w:t>
+      </w:r>
+    </w:p>
+    <w:p>
+      <w:r>
+        <w:drawing>
+          <wp:inline distT="0" distB="0" distL="0" distR="0" wp14:anchorId="538C8BFC" wp14:editId="580C9EC8">
+            <wp:extent cx="6120765" cy="2978785"/>
+            <wp:effectExtent l="0" t="0" r="0" b="0"/>
+            <wp:docPr id="75706275" name="Рисунок 1"/>
+            <wp:cNvGraphicFramePr>
+              <a:graphicFrameLocks xmlns:a="http://schemas.openxmlformats.org/drawingml/2006/main" noChangeAspect="1"/>
+            </wp:cNvGraphicFramePr>
+            <a:graphic xmlns:a="http://schemas.openxmlformats.org/drawingml/2006/main">
+              <a:graphicData uri="http://schemas.openxmlformats.org/drawingml/2006/picture">
+                <pic:pic xmlns:pic="http://schemas.openxmlformats.org/drawingml/2006/picture">
+                  <pic:nvPicPr>
+                    <pic:cNvPr id="75706275" name=""/>
+                    <pic:cNvPicPr/>
+                  </pic:nvPicPr>
+                  <pic:blipFill>
+                    <a:blip r:embed="rId12"/>
+                    <a:stretch>
+                      <a:fillRect/>
+                    </a:stretch>
+                  </pic:blipFill>
+                  <pic:spPr>
+                    <a:xfrm>
+                      <a:off x="0" y="0"/>
+                      <a:ext cx="6120765" cy="2978785"/>
+                    </a:xfrm>
+                    <a:prstGeom prst="rect">
+                      <a:avLst/>
+                    </a:prstGeom>
+                  </pic:spPr>
+                </pic:pic>
+              </a:graphicData>
+            </a:graphic>
+          </wp:inline>
+        </w:drawing>
+      </w:r>
+    </w:p>
+    <w:p>
+      <w:pPr>
+        <w:jc w:val="center"/>
+      </w:pPr>
+      <w:r>
+        <w:t>Рисунок 4 —</w:t>
+      </w:r>
+      <w:r>
+        <w:t xml:space="preserve"> Главная страница </w:t>
+      </w:r>
+      <w:r>
+        <w:rPr>
+          <w:lang w:val="en-US"/>
+        </w:rPr>
+        <w:t>Wazuh</w:t>
+      </w:r>
+      <w:r>
+        <w:t xml:space="preserve"> </w:t>
+      </w:r>
+      <w:r>
+        <w:rPr>
+          <w:lang w:val="en-US"/>
+        </w:rPr>
+        <w:t>Dashboard</w:t>
+      </w:r>
+    </w:p>
+    <w:p>
+      <w:hyperlink r:id="rId13" w:history="1">
+        <w:r>
+          <w:rPr>
+            <w:rStyle w:val="af"/>
+            <w:lang w:val="en-US"/>
+          </w:rPr>
+          <w:t>https</w:t>
+        </w:r>
+        <w:r>
+          <w:rPr>
+            <w:rStyle w:val="af"/>
+          </w:rPr>
+          <w:t>://</w:t>
+        </w:r>
+        <w:r>
+          <w:rPr>
+            <w:rStyle w:val="af"/>
+            <w:lang w:val="en-US"/>
+          </w:rPr>
+          <w:t>documentation</w:t>
+        </w:r>
+        <w:r>
+          <w:rPr>
+            <w:rStyle w:val="af"/>
+          </w:rPr>
+          <w:t>.</w:t>
+        </w:r>
+        <w:r>
+          <w:rPr>
+            <w:rStyle w:val="af"/>
+            <w:lang w:val="en-US"/>
+          </w:rPr>
+          <w:t>waz</w:t>
+        </w:r>
+        <w:r>
+          <w:rPr>
+            <w:rStyle w:val="af"/>
+            <w:lang w:val="en-US"/>
+          </w:rPr>
+          <w:t>u</w:t>
+        </w:r>
+        <w:r>
+          <w:rPr>
+            <w:rStyle w:val="af"/>
+            <w:lang w:val="en-US"/>
+          </w:rPr>
+          <w:t>h</w:t>
+        </w:r>
+        <w:r>
+          <w:rPr>
+            <w:rStyle w:val="af"/>
+          </w:rPr>
+          <w:t>.</w:t>
+        </w:r>
+        <w:r>
+          <w:rPr>
+            <w:rStyle w:val="af"/>
+            <w:lang w:val="en-US"/>
+          </w:rPr>
+          <w:t>com</w:t>
+        </w:r>
+        <w:r>
+          <w:rPr>
+            <w:rStyle w:val="af"/>
+          </w:rPr>
+          <w:t>/</w:t>
+        </w:r>
+        <w:r>
+          <w:rPr>
+            <w:rStyle w:val="af"/>
+            <w:lang w:val="en-US"/>
+          </w:rPr>
+          <w:t>current</w:t>
+        </w:r>
+        <w:r>
+          <w:rPr>
+            <w:rStyle w:val="af"/>
+          </w:rPr>
+          <w:t>/</w:t>
+        </w:r>
+        <w:r>
+          <w:rPr>
+            <w:rStyle w:val="af"/>
+            <w:lang w:val="en-US"/>
+          </w:rPr>
+          <w:t>installation</w:t>
+        </w:r>
+        <w:r>
+          <w:rPr>
+            <w:rStyle w:val="af"/>
+          </w:rPr>
+          <w:t>-</w:t>
+        </w:r>
+        <w:r>
+          <w:rPr>
+            <w:rStyle w:val="af"/>
+            <w:lang w:val="en-US"/>
+          </w:rPr>
+          <w:t>guide</w:t>
+        </w:r>
+        <w:r>
+          <w:rPr>
+            <w:rStyle w:val="af"/>
+          </w:rPr>
+          <w:t>/</w:t>
+        </w:r>
+        <w:r>
+          <w:rPr>
+            <w:rStyle w:val="af"/>
+            <w:lang w:val="en-US"/>
+          </w:rPr>
+          <w:t>wazuh</w:t>
+        </w:r>
+        <w:r>
+          <w:rPr>
+            <w:rStyle w:val="af"/>
+          </w:rPr>
+          <w:t>-</w:t>
+        </w:r>
+        <w:r>
+          <w:rPr>
+            <w:rStyle w:val="af"/>
+            <w:lang w:val="en-US"/>
+          </w:rPr>
+          <w:t>dashboard</w:t>
+        </w:r>
+        <w:r>
+          <w:rPr>
+            <w:rStyle w:val="af"/>
+          </w:rPr>
+          <w:t>/</w:t>
+        </w:r>
+        <w:r>
+          <w:rPr>
+            <w:rStyle w:val="af"/>
+            <w:lang w:val="en-US"/>
+          </w:rPr>
+          <w:t>installation</w:t>
+        </w:r>
+        <w:r>
+          <w:rPr>
+            <w:rStyle w:val="af"/>
+          </w:rPr>
+          <w:t>-</w:t>
+        </w:r>
+        <w:r>
+          <w:rPr>
+            <w:rStyle w:val="af"/>
+            <w:lang w:val="en-US"/>
+          </w:rPr>
+          <w:t>assistant</w:t>
+        </w:r>
+        <w:r>
+          <w:rPr>
+            <w:rStyle w:val="af"/>
+          </w:rPr>
+          <w:t>.</w:t>
+        </w:r>
+        <w:r>
+          <w:rPr>
+            <w:rStyle w:val="af"/>
+            <w:lang w:val="en-US"/>
+          </w:rPr>
+          <w:t>html</w:t>
+        </w:r>
+      </w:hyperlink>
+      <w:r>
+        <w:t xml:space="preserve"> </w:t>
+      </w:r>
+    </w:p>
+    <w:p>
+      <w:r>
+        <w:lastRenderedPageBreak/>
+        <w:t xml:space="preserve">Убедимся, что все системы в норме. </w:t>
+      </w:r>
+      <w:r>
+        <w:t>М</w:t>
+      </w:r>
+      <w:r>
+        <w:t>ожно увидеть на рисунке 5</w:t>
+      </w:r>
+      <w:r>
+        <w:t xml:space="preserve">, что все три системы в статусе </w:t>
+      </w:r>
+      <w:r>
+        <w:rPr>
+          <w:lang w:val="en-US"/>
+        </w:rPr>
+        <w:t>active</w:t>
+      </w:r>
+      <w:r>
+        <w:t>.</w:t>
+      </w:r>
+    </w:p>
+    <w:p>
+      <w:pPr>
+        <w:rPr>
+          <w:lang w:val="en-US"/>
+        </w:rPr>
+      </w:pPr>
+      <w:r>
+        <w:rPr>
+          <w:lang w:val="en-US"/>
+        </w:rPr>
+        <w:drawing>
+          <wp:inline distT="0" distB="0" distL="0" distR="0" wp14:anchorId="3ED7164A" wp14:editId="7A0AC3E0">
+            <wp:extent cx="6120765" cy="1715135"/>
+            <wp:effectExtent l="0" t="0" r="0" b="0"/>
+            <wp:docPr id="1490880427" name="Рисунок 1"/>
+            <wp:cNvGraphicFramePr>
+              <a:graphicFrameLocks xmlns:a="http://schemas.openxmlformats.org/drawingml/2006/main" noChangeAspect="1"/>
+            </wp:cNvGraphicFramePr>
+            <a:graphic xmlns:a="http://schemas.openxmlformats.org/drawingml/2006/main">
+              <a:graphicData uri="http://schemas.openxmlformats.org/drawingml/2006/picture">
+                <pic:pic xmlns:pic="http://schemas.openxmlformats.org/drawingml/2006/picture">
+                  <pic:nvPicPr>
+                    <pic:cNvPr id="1490880427" name=""/>
+                    <pic:cNvPicPr/>
+                  </pic:nvPicPr>
+                  <pic:blipFill>
+                    <a:blip r:embed="rId14"/>
+                    <a:stretch>
+                      <a:fillRect/>
+                    </a:stretch>
+                  </pic:blipFill>
+                  <pic:spPr>
+                    <a:xfrm>
+                      <a:off x="0" y="0"/>
+                      <a:ext cx="6120765" cy="1715135"/>
+                    </a:xfrm>
+                    <a:prstGeom prst="rect">
+                      <a:avLst/>
+                    </a:prstGeom>
+                  </pic:spPr>
+                </pic:pic>
+              </a:graphicData>
+            </a:graphic>
+          </wp:inline>
+        </w:drawing>
+      </w:r>
+    </w:p>
+    <w:p>
+      <w:pPr>
+        <w:jc w:val="center"/>
+      </w:pPr>
+      <w:r>
+        <w:t xml:space="preserve">Рисунок </w:t>
+      </w:r>
+      <w:r>
+        <w:t>5</w:t>
+      </w:r>
+      <w:r>
+        <w:t xml:space="preserve"> —</w:t>
+      </w:r>
+      <w:r>
+        <w:t xml:space="preserve"> </w:t>
+      </w:r>
+      <w:r>
+        <w:t xml:space="preserve">Вывод </w:t>
+      </w:r>
+      <w:r>
+        <w:rPr>
+          <w:lang w:val="en-US"/>
+        </w:rPr>
+        <w:t>systemctl</w:t>
+      </w:r>
+    </w:p>
+    <w:p>
+      <w:r>
+        <w:t xml:space="preserve">Далее необходимо развернуть вторую виртуальную машину, на которой необходимо поставить </w:t>
+      </w:r>
+      <w:r>
+        <w:rPr>
+          <w:lang w:val="en-US"/>
+        </w:rPr>
+        <w:t>wazuh</w:t>
+      </w:r>
+      <w:r>
+        <w:t>-</w:t>
+      </w:r>
+      <w:r>
+        <w:rPr>
+          <w:lang w:val="en-US"/>
+        </w:rPr>
+        <w:t>agent</w:t>
+      </w:r>
+      <w:r>
+        <w:t>.</w:t>
+      </w:r>
+      <w:r>
+        <w:t xml:space="preserve"> Выполняем те же действия по настройке сети и выполняем установку, после чего запускаем службу. Результат продемонстрирован на рисунке 6.</w:t>
+      </w:r>
+    </w:p>
+    <w:p>
+      <w:r>
+        <w:drawing>
+          <wp:inline distT="0" distB="0" distL="0" distR="0" wp14:anchorId="74916AC9" wp14:editId="7BA15195">
+            <wp:extent cx="6120765" cy="3046730"/>
+            <wp:effectExtent l="0" t="0" r="0" b="1270"/>
+            <wp:docPr id="1999380756" name="Рисунок 1"/>
+            <wp:cNvGraphicFramePr>
+              <a:graphicFrameLocks xmlns:a="http://schemas.openxmlformats.org/drawingml/2006/main" noChangeAspect="1"/>
+            </wp:cNvGraphicFramePr>
+            <a:graphic xmlns:a="http://schemas.openxmlformats.org/drawingml/2006/main">
+              <a:graphicData uri="http://schemas.openxmlformats.org/drawingml/2006/picture">
+                <pic:pic xmlns:pic="http://schemas.openxmlformats.org/drawingml/2006/picture">
+                  <pic:nvPicPr>
+                    <pic:cNvPr id="1999380756" name=""/>
+                    <pic:cNvPicPr/>
+                  </pic:nvPicPr>
+                  <pic:blipFill>
+                    <a:blip r:embed="rId15"/>
+                    <a:stretch>
+                      <a:fillRect/>
+                    </a:stretch>
+                  </pic:blipFill>
+                  <pic:spPr>
+                    <a:xfrm>
+                      <a:off x="0" y="0"/>
+                      <a:ext cx="6120765" cy="3046730"/>
+                    </a:xfrm>
+                    <a:prstGeom prst="rect">
+                      <a:avLst/>
+                    </a:prstGeom>
+                  </pic:spPr>
+                </pic:pic>
+              </a:graphicData>
+            </a:graphic>
+          </wp:inline>
+        </w:drawing>
+      </w:r>
+    </w:p>
+    <w:p>
+      <w:pPr>
+        <w:jc w:val="center"/>
+        <w:rPr>
+          <w:lang w:val="en-US"/>
+        </w:rPr>
+      </w:pPr>
+      <w:r>
+        <w:t xml:space="preserve">Рисунок  </w:t>
+      </w:r>
+      <w:r>
+        <w:t xml:space="preserve">6 </w:t>
+      </w:r>
+      <w:r>
+        <w:t>—</w:t>
+      </w:r>
+      <w:r>
+        <w:t xml:space="preserve"> </w:t>
+      </w:r>
+      <w:r>
+        <w:t xml:space="preserve">Вывод </w:t>
+      </w:r>
+      <w:r>
+        <w:t xml:space="preserve">статуса </w:t>
+      </w:r>
+      <w:r>
+        <w:rPr>
+          <w:lang w:val="en-US"/>
+        </w:rPr>
+        <w:t>wazuh</w:t>
+      </w:r>
+      <w:r>
+        <w:t>-</w:t>
+      </w:r>
+      <w:r>
+        <w:rPr>
+          <w:lang w:val="en-US"/>
+        </w:rPr>
+        <w:t>agent</w:t>
+      </w:r>
+    </w:p>
+    <w:p>
+      <w:r>
+        <w:rPr>
+          <w:lang w:val="en-US"/>
+        </w:rPr>
+        <w:tab/>
+      </w:r>
+      <w:r>
+        <w:t xml:space="preserve">Переходим на страницу в браузере и видим, что на главном экране обновилось поле </w:t>
+      </w:r>
+      <w:r>
+        <w:rPr>
+          <w:lang w:val="en-US"/>
+        </w:rPr>
+        <w:t>Agent</w:t>
+      </w:r>
+      <w:r>
+        <w:t xml:space="preserve"> </w:t>
+      </w:r>
+      <w:r>
+        <w:rPr>
+          <w:lang w:val="en-US"/>
+        </w:rPr>
+        <w:t>Summary</w:t>
+      </w:r>
+      <w:r>
+        <w:t>, в котором видим, что появился один агент</w:t>
+      </w:r>
+      <w:r>
+        <w:t xml:space="preserve"> (Рисунок 7 а, б)</w:t>
+      </w:r>
+      <w:r>
+        <w:t xml:space="preserve">. </w:t>
+      </w:r>
+    </w:p>
+    <w:p>
+      <w:r>
+        <w:lastRenderedPageBreak/>
+        <w:drawing>
+          <wp:inline distT="0" distB="0" distL="0" distR="0" wp14:anchorId="20834E94" wp14:editId="15399327">
+            <wp:extent cx="6120765" cy="2649855"/>
+            <wp:effectExtent l="0" t="0" r="0" b="0"/>
+            <wp:docPr id="1846073004" name="Рисунок 1"/>
+            <wp:cNvGraphicFramePr>
+              <a:graphicFrameLocks xmlns:a="http://schemas.openxmlformats.org/drawingml/2006/main" noChangeAspect="1"/>
+            </wp:cNvGraphicFramePr>
+            <a:graphic xmlns:a="http://schemas.openxmlformats.org/drawingml/2006/main">
+              <a:graphicData uri="http://schemas.openxmlformats.org/drawingml/2006/picture">
+                <pic:pic xmlns:pic="http://schemas.openxmlformats.org/drawingml/2006/picture">
+                  <pic:nvPicPr>
+                    <pic:cNvPr id="1846073004" name=""/>
+                    <pic:cNvPicPr/>
+                  </pic:nvPicPr>
+                  <pic:blipFill>
+                    <a:blip r:embed="rId16"/>
+                    <a:stretch>
+                      <a:fillRect/>
+                    </a:stretch>
+                  </pic:blipFill>
+                  <pic:spPr>
+                    <a:xfrm>
+                      <a:off x="0" y="0"/>
+                      <a:ext cx="6120765" cy="2649855"/>
+                    </a:xfrm>
+                    <a:prstGeom prst="rect">
+                      <a:avLst/>
+                    </a:prstGeom>
+                  </pic:spPr>
+                </pic:pic>
+              </a:graphicData>
+            </a:graphic>
+          </wp:inline>
+        </w:drawing>
+      </w:r>
+    </w:p>
+    <w:p>
+      <w:r>
+        <w:drawing>
+          <wp:inline distT="0" distB="0" distL="0" distR="0" wp14:anchorId="4465A9A8" wp14:editId="0ADEA79D">
+            <wp:extent cx="6120765" cy="2286635"/>
+            <wp:effectExtent l="0" t="0" r="0" b="0"/>
+            <wp:docPr id="393190860" name="Рисунок 1"/>
+            <wp:cNvGraphicFramePr>
+              <a:graphicFrameLocks xmlns:a="http://schemas.openxmlformats.org/drawingml/2006/main" noChangeAspect="1"/>
+            </wp:cNvGraphicFramePr>
+            <a:graphic xmlns:a="http://schemas.openxmlformats.org/drawingml/2006/main">
+              <a:graphicData uri="http://schemas.openxmlformats.org/drawingml/2006/picture">
+                <pic:pic xmlns:pic="http://schemas.openxmlformats.org/drawingml/2006/picture">
+                  <pic:nvPicPr>
+                    <pic:cNvPr id="393190860" name=""/>
+                    <pic:cNvPicPr/>
+                  </pic:nvPicPr>
+                  <pic:blipFill>
+                    <a:blip r:embed="rId17"/>
+                    <a:stretch>
+                      <a:fillRect/>
+                    </a:stretch>
+                  </pic:blipFill>
+                  <pic:spPr>
+                    <a:xfrm>
+                      <a:off x="0" y="0"/>
+                      <a:ext cx="6120765" cy="2286635"/>
+                    </a:xfrm>
+                    <a:prstGeom prst="rect">
+                      <a:avLst/>
+                    </a:prstGeom>
+                  </pic:spPr>
+                </pic:pic>
+              </a:graphicData>
+            </a:graphic>
+          </wp:inline>
+        </w:drawing>
+      </w:r>
+    </w:p>
+    <w:p>
+      <w:pPr>
+        <w:jc w:val="center"/>
+      </w:pPr>
+      <w:r>
+        <w:t xml:space="preserve">Рисунок 7 (а, б) — (а) Главная страница </w:t>
+      </w:r>
+      <w:r>
+        <w:rPr>
+          <w:lang w:val="en-US"/>
+        </w:rPr>
+        <w:t>wazuh</w:t>
+      </w:r>
+      <w:r>
+        <w:t xml:space="preserve">, (б) Отображение агента во вкладке </w:t>
+      </w:r>
+      <w:r>
+        <w:rPr>
+          <w:lang w:val="en-US"/>
+        </w:rPr>
+        <w:t>endpoints</w:t>
+      </w:r>
+    </w:p>
+    <w:p>
+      <w:r>
+        <w:t xml:space="preserve">Затем </w:t>
+      </w:r>
+      <w:r>
+        <w:t xml:space="preserve">включим </w:t>
+      </w:r>
+      <w:r>
+        <w:rPr>
+          <w:lang w:val="en-US"/>
+        </w:rPr>
+        <w:t>filebeat</w:t>
+      </w:r>
+      <w:r>
+        <w:t>,</w:t>
+      </w:r>
+      <w:r>
+        <w:t xml:space="preserve"> если он выключен, ведь без него логи отправляться не будут. Перейдём на вкладку </w:t>
+      </w:r>
+      <w:r>
+        <w:rPr>
+          <w:lang w:val="en-US"/>
+        </w:rPr>
+        <w:t>Discover</w:t>
+      </w:r>
+      <w:r>
+        <w:t xml:space="preserve"> и увидим диаграмму с предупреждениями </w:t>
+      </w:r>
+      <w:r>
+        <w:rPr>
+          <w:lang w:val="en-US"/>
+        </w:rPr>
+        <w:t>wazuh</w:t>
+      </w:r>
+      <w:r>
+        <w:t>-</w:t>
+      </w:r>
+      <w:r>
+        <w:rPr>
+          <w:lang w:val="en-US"/>
+        </w:rPr>
+        <w:t>alerts</w:t>
+      </w:r>
+      <w:r>
+        <w:t>-*</w:t>
+      </w:r>
+      <w:r>
+        <w:t>. Выберем фильтрацию по необходимому нам агенту (</w:t>
+      </w:r>
+      <w:r>
+        <w:rPr>
+          <w:lang w:val="en-US"/>
+        </w:rPr>
+        <w:t>wazuh</w:t>
+      </w:r>
+      <w:r>
+        <w:t>-</w:t>
+      </w:r>
+      <w:r>
+        <w:rPr>
+          <w:lang w:val="en-US"/>
+        </w:rPr>
+        <w:t>agent</w:t>
+      </w:r>
+      <w:r>
+        <w:t>-1</w:t>
+      </w:r>
+      <w:r>
+        <w:t>) и применим фильтр, как показано на Рисунке 8.</w:t>
+      </w:r>
+    </w:p>
+    <w:p>
+      <w:r>
+        <w:lastRenderedPageBreak/>
+        <w:drawing>
+          <wp:inline distT="0" distB="0" distL="0" distR="0" wp14:anchorId="4FABF565" wp14:editId="5E0B26E0">
+            <wp:extent cx="6120765" cy="2849880"/>
+            <wp:effectExtent l="0" t="0" r="0" b="7620"/>
+            <wp:docPr id="17620057" name="Рисунок 1"/>
+            <wp:cNvGraphicFramePr>
+              <a:graphicFrameLocks xmlns:a="http://schemas.openxmlformats.org/drawingml/2006/main" noChangeAspect="1"/>
+            </wp:cNvGraphicFramePr>
+            <a:graphic xmlns:a="http://schemas.openxmlformats.org/drawingml/2006/main">
+              <a:graphicData uri="http://schemas.openxmlformats.org/drawingml/2006/picture">
+                <pic:pic xmlns:pic="http://schemas.openxmlformats.org/drawingml/2006/picture">
+                  <pic:nvPicPr>
+                    <pic:cNvPr id="17620057" name=""/>
+                    <pic:cNvPicPr/>
+                  </pic:nvPicPr>
+                  <pic:blipFill>
+                    <a:blip r:embed="rId18"/>
+                    <a:stretch>
+                      <a:fillRect/>
+                    </a:stretch>
+                  </pic:blipFill>
+                  <pic:spPr>
+                    <a:xfrm>
+                      <a:off x="0" y="0"/>
+                      <a:ext cx="6120765" cy="2849880"/>
+                    </a:xfrm>
+                    <a:prstGeom prst="rect">
+                      <a:avLst/>
+                    </a:prstGeom>
+                  </pic:spPr>
+                </pic:pic>
+              </a:graphicData>
+            </a:graphic>
+          </wp:inline>
+        </w:drawing>
+      </w:r>
+    </w:p>
+    <w:p>
+      <w:pPr>
+        <w:jc w:val="center"/>
+      </w:pPr>
+      <w:r>
+        <w:t>Рисунок 8 — Фильтрация событий</w:t>
+      </w:r>
+    </w:p>
+    <w:p>
+      <w:r>
+        <w:t xml:space="preserve">В результате мы видим все предупреждения, которые были выявлены и сделаны на виртуальной машине агента. На рисунке 9 можно увидеть, что </w:t>
+      </w:r>
+      <w:r>
+        <w:rPr>
+          <w:lang w:val="en-US"/>
+        </w:rPr>
+        <w:t>wazuh</w:t>
+      </w:r>
+      <w:r>
+        <w:t xml:space="preserve"> зафиксировал применение команды </w:t>
+      </w:r>
+      <w:r>
+        <w:rPr>
+          <w:lang w:val="en-US"/>
+        </w:rPr>
+        <w:t>passwd</w:t>
+      </w:r>
+      <w:r>
+        <w:t>.</w:t>
+      </w:r>
+      <w:r>
+        <w:t xml:space="preserve"> Уровень опасности при этом 3-й, что говорит нам о низкой угрозе и является нормальной административной активностью. </w:t>
+      </w:r>
+    </w:p>
+    <w:p>
+      <w:r>
+        <w:rPr>
+          <w:lang w:val="en-US"/>
+        </w:rPr>
+        <w:drawing>
+          <wp:inline distT="0" distB="0" distL="0" distR="0" wp14:anchorId="5D502A2E" wp14:editId="6640A5B0">
+            <wp:extent cx="6120765" cy="3173095"/>
+            <wp:effectExtent l="0" t="0" r="0" b="8255"/>
+            <wp:docPr id="1868974233" name="Рисунок 1"/>
+            <wp:cNvGraphicFramePr>
+              <a:graphicFrameLocks xmlns:a="http://schemas.openxmlformats.org/drawingml/2006/main" noChangeAspect="1"/>
+            </wp:cNvGraphicFramePr>
+            <a:graphic xmlns:a="http://schemas.openxmlformats.org/drawingml/2006/main">
+              <a:graphicData uri="http://schemas.openxmlformats.org/drawingml/2006/picture">
+                <pic:pic xmlns:pic="http://schemas.openxmlformats.org/drawingml/2006/picture">
+                  <pic:nvPicPr>
+                    <pic:cNvPr id="1868974233" name=""/>
+                    <pic:cNvPicPr/>
+                  </pic:nvPicPr>
+                  <pic:blipFill>
+                    <a:blip r:embed="rId19"/>
+                    <a:stretch>
+                      <a:fillRect/>
+                    </a:stretch>
+                  </pic:blipFill>
+                  <pic:spPr>
+                    <a:xfrm>
+                      <a:off x="0" y="0"/>
+                      <a:ext cx="6120765" cy="3173095"/>
+                    </a:xfrm>
+                    <a:prstGeom prst="rect">
+                      <a:avLst/>
+                    </a:prstGeom>
+                  </pic:spPr>
+                </pic:pic>
+              </a:graphicData>
+            </a:graphic>
+          </wp:inline>
+        </w:drawing>
+      </w:r>
+    </w:p>
+    <w:p>
+      <w:pPr>
+        <w:jc w:val="center"/>
+      </w:pPr>
+      <w:r>
+        <w:t xml:space="preserve">Рисунок 9 — Разбор события на агенте </w:t>
+      </w:r>
+      <w:r>
+        <w:rPr>
+          <w:lang w:val="en-US"/>
+        </w:rPr>
+        <w:t>wazuh</w:t>
+      </w:r>
+      <w:r>
+        <w:t>-</w:t>
+      </w:r>
+      <w:r>
+        <w:rPr>
+          <w:lang w:val="en-US"/>
+        </w:rPr>
+        <w:t>agent</w:t>
+      </w:r>
+      <w:r>
+        <w:t>-1</w:t>
+      </w:r>
+    </w:p>
+    <w:p/>
     <w:p/>
     <w:sectPr>
       <w:type w:val="continuous"/>
@@ -128,6 +2277,243 @@
     </w:sectPr>
   </w:body>
 </w:document>
+</file>
+
+<file path=word/numbering.xml><?xml version="1.0" encoding="utf-8"?>
+<w:numbering xmlns:wpc="http://schemas.microsoft.com/office/word/2010/wordprocessingCanvas" xmlns:cx="http://schemas.microsoft.com/office/drawing/2014/chartex" xmlns:cx1="http://schemas.microsoft.com/office/drawing/2015/9/8/chartex" xmlns:cx2="http://schemas.microsoft.com/office/drawing/2015/10/21/chartex" xmlns:cx3="http://schemas.microsoft.com/office/drawing/2016/5/9/chartex" xmlns:cx4="http://schemas.microsoft.com/office/drawing/2016/5/10/chartex" xmlns:cx5="http://schemas.microsoft.com/office/drawing/2016/5/11/chartex" xmlns:cx6="http://schemas.microsoft.com/office/drawing/2016/5/12/chartex" xmlns:cx7="http://schemas.microsoft.com/office/drawing/2016/5/13/chartex" xmlns:cx8="http://schemas.microsoft.com/office/drawing/2016/5/14/chartex" xmlns:mc="http://schemas.openxmlformats.org/markup-compatibility/2006" xmlns:aink="http://schemas.microsoft.com/office/drawing/2016/ink" xmlns:am3d="http://schemas.microsoft.com/office/drawing/2017/model3d" xmlns:o="urn:schemas-microsoft-com:office:office" xmlns:oel="http://schemas.microsoft.com/office/2019/extlst" xmlns:r="http://schemas.openxmlformats.org/officeDocument/2006/relationships" xmlns:m="http://schemas.openxmlformats.org/officeDocument/2006/math" xmlns:v="urn:schemas-microsoft-com:vml" xmlns:wp14="http://schemas.microsoft.com/office/word/2010/wordprocessingDrawing" xmlns:wp="http://schemas.openxmlformats.org/drawingml/2006/wordprocessingDrawing" xmlns:w10="urn:schemas-microsoft-com:office:word" xmlns:w="http://schemas.openxmlformats.org/wordprocessingml/2006/main" xmlns:w14="http://schemas.microsoft.com/office/word/2010/wordml" xmlns:w15="http://schemas.microsoft.com/office/word/2012/wordml" xmlns:w16cex="http://schemas.microsoft.com/office/word/2018/wordml/cex" xmlns:w16cid="http://schemas.microsoft.com/office/word/2016/wordml/cid" xmlns:w16="http://schemas.microsoft.com/office/word/2018/wordml" xmlns:w16du="http://schemas.microsoft.com/office/word/2023/wordml/word16du" xmlns:w16sdtdh="http://schemas.microsoft.com/office/word/2020/wordml/sdtdatahash" xmlns:w16sdtfl="http://schemas.microsoft.com/office/word/2024/wordml/sdtformatlock" xmlns:w16se="http://schemas.microsoft.com/office/word/2015/wordml/symex" xmlns:wpg="http://schemas.microsoft.com/office/word/2010/wordprocessingGroup" xmlns:wpi="http://schemas.microsoft.com/office/word/2010/wordprocessingInk" xmlns:wne="http://schemas.microsoft.com/office/word/2006/wordml" xmlns:wps="http://schemas.microsoft.com/office/word/2010/wordprocessingShape" mc:Ignorable="w14 w15 w16se w16cid w16 w16cex w16sdtdh w16sdtfl w16du wp14">
+  <w:abstractNum w:abstractNumId="0" w15:restartNumberingAfterBreak="0">
+    <w:nsid w:val="23C9075D"/>
+    <w:multiLevelType w:val="hybridMultilevel"/>
+    <w:tmpl w:val="5EE62686"/>
+    <w:lvl w:ilvl="0" w:tplc="503466CE">
+      <w:start w:val="1"/>
+      <w:numFmt w:val="bullet"/>
+      <w:lvlText w:val=""/>
+      <w:lvlJc w:val="left"/>
+      <w:pPr>
+        <w:ind w:left="1429" w:hanging="360"/>
+      </w:pPr>
+      <w:rPr>
+        <w:rFonts w:ascii="Symbol" w:hAnsi="Symbol" w:hint="default"/>
+      </w:rPr>
+    </w:lvl>
+    <w:lvl w:ilvl="1" w:tplc="04190003" w:tentative="1">
+      <w:start w:val="1"/>
+      <w:numFmt w:val="bullet"/>
+      <w:lvlText w:val="o"/>
+      <w:lvlJc w:val="left"/>
+      <w:pPr>
+        <w:ind w:left="1440" w:hanging="360"/>
+      </w:pPr>
+      <w:rPr>
+        <w:rFonts w:ascii="Courier New" w:hAnsi="Courier New" w:cs="Courier New" w:hint="default"/>
+      </w:rPr>
+    </w:lvl>
+    <w:lvl w:ilvl="2" w:tplc="04190005" w:tentative="1">
+      <w:start w:val="1"/>
+      <w:numFmt w:val="bullet"/>
+      <w:lvlText w:val=""/>
+      <w:lvlJc w:val="left"/>
+      <w:pPr>
+        <w:ind w:left="2160" w:hanging="360"/>
+      </w:pPr>
+      <w:rPr>
+        <w:rFonts w:ascii="Wingdings" w:hAnsi="Wingdings" w:hint="default"/>
+      </w:rPr>
+    </w:lvl>
+    <w:lvl w:ilvl="3" w:tplc="04190001" w:tentative="1">
+      <w:start w:val="1"/>
+      <w:numFmt w:val="bullet"/>
+      <w:lvlText w:val=""/>
+      <w:lvlJc w:val="left"/>
+      <w:pPr>
+        <w:ind w:left="2880" w:hanging="360"/>
+      </w:pPr>
+      <w:rPr>
+        <w:rFonts w:ascii="Symbol" w:hAnsi="Symbol" w:hint="default"/>
+      </w:rPr>
+    </w:lvl>
+    <w:lvl w:ilvl="4" w:tplc="04190003" w:tentative="1">
+      <w:start w:val="1"/>
+      <w:numFmt w:val="bullet"/>
+      <w:lvlText w:val="o"/>
+      <w:lvlJc w:val="left"/>
+      <w:pPr>
+        <w:ind w:left="3600" w:hanging="360"/>
+      </w:pPr>
+      <w:rPr>
+        <w:rFonts w:ascii="Courier New" w:hAnsi="Courier New" w:cs="Courier New" w:hint="default"/>
+      </w:rPr>
+    </w:lvl>
+    <w:lvl w:ilvl="5" w:tplc="04190005" w:tentative="1">
+      <w:start w:val="1"/>
+      <w:numFmt w:val="bullet"/>
+      <w:lvlText w:val=""/>
+      <w:lvlJc w:val="left"/>
+      <w:pPr>
+        <w:ind w:left="4320" w:hanging="360"/>
+      </w:pPr>
+      <w:rPr>
+        <w:rFonts w:ascii="Wingdings" w:hAnsi="Wingdings" w:hint="default"/>
+      </w:rPr>
+    </w:lvl>
+    <w:lvl w:ilvl="6" w:tplc="04190001" w:tentative="1">
+      <w:start w:val="1"/>
+      <w:numFmt w:val="bullet"/>
+      <w:lvlText w:val=""/>
+      <w:lvlJc w:val="left"/>
+      <w:pPr>
+        <w:ind w:left="5040" w:hanging="360"/>
+      </w:pPr>
+      <w:rPr>
+        <w:rFonts w:ascii="Symbol" w:hAnsi="Symbol" w:hint="default"/>
+      </w:rPr>
+    </w:lvl>
+    <w:lvl w:ilvl="7" w:tplc="04190003" w:tentative="1">
+      <w:start w:val="1"/>
+      <w:numFmt w:val="bullet"/>
+      <w:lvlText w:val="o"/>
+      <w:lvlJc w:val="left"/>
+      <w:pPr>
+        <w:ind w:left="5760" w:hanging="360"/>
+      </w:pPr>
+      <w:rPr>
+        <w:rFonts w:ascii="Courier New" w:hAnsi="Courier New" w:cs="Courier New" w:hint="default"/>
+      </w:rPr>
+    </w:lvl>
+    <w:lvl w:ilvl="8" w:tplc="04190005" w:tentative="1">
+      <w:start w:val="1"/>
+      <w:numFmt w:val="bullet"/>
+      <w:lvlText w:val=""/>
+      <w:lvlJc w:val="left"/>
+      <w:pPr>
+        <w:ind w:left="6480" w:hanging="360"/>
+      </w:pPr>
+      <w:rPr>
+        <w:rFonts w:ascii="Wingdings" w:hAnsi="Wingdings" w:hint="default"/>
+      </w:rPr>
+    </w:lvl>
+  </w:abstractNum>
+  <w:abstractNum w:abstractNumId="1" w15:restartNumberingAfterBreak="0">
+    <w:nsid w:val="73F54C78"/>
+    <w:multiLevelType w:val="hybridMultilevel"/>
+    <w:tmpl w:val="A530CB9C"/>
+    <w:lvl w:ilvl="0" w:tplc="503466CE">
+      <w:start w:val="1"/>
+      <w:numFmt w:val="bullet"/>
+      <w:lvlText w:val=""/>
+      <w:lvlJc w:val="left"/>
+      <w:pPr>
+        <w:ind w:left="720" w:hanging="360"/>
+      </w:pPr>
+      <w:rPr>
+        <w:rFonts w:ascii="Symbol" w:hAnsi="Symbol" w:hint="default"/>
+      </w:rPr>
+    </w:lvl>
+    <w:lvl w:ilvl="1" w:tplc="04190003" w:tentative="1">
+      <w:start w:val="1"/>
+      <w:numFmt w:val="bullet"/>
+      <w:lvlText w:val="o"/>
+      <w:lvlJc w:val="left"/>
+      <w:pPr>
+        <w:ind w:left="1440" w:hanging="360"/>
+      </w:pPr>
+      <w:rPr>
+        <w:rFonts w:ascii="Courier New" w:hAnsi="Courier New" w:cs="Courier New" w:hint="default"/>
+      </w:rPr>
+    </w:lvl>
+    <w:lvl w:ilvl="2" w:tplc="04190005" w:tentative="1">
+      <w:start w:val="1"/>
+      <w:numFmt w:val="bullet"/>
+      <w:lvlText w:val=""/>
+      <w:lvlJc w:val="left"/>
+      <w:pPr>
+        <w:ind w:left="2160" w:hanging="360"/>
+      </w:pPr>
+      <w:rPr>
+        <w:rFonts w:ascii="Wingdings" w:hAnsi="Wingdings" w:hint="default"/>
+      </w:rPr>
+    </w:lvl>
+    <w:lvl w:ilvl="3" w:tplc="04190001" w:tentative="1">
+      <w:start w:val="1"/>
+      <w:numFmt w:val="bullet"/>
+      <w:lvlText w:val=""/>
+      <w:lvlJc w:val="left"/>
+      <w:pPr>
+        <w:ind w:left="2880" w:hanging="360"/>
+      </w:pPr>
+      <w:rPr>
+        <w:rFonts w:ascii="Symbol" w:hAnsi="Symbol" w:hint="default"/>
+      </w:rPr>
+    </w:lvl>
+    <w:lvl w:ilvl="4" w:tplc="04190003" w:tentative="1">
+      <w:start w:val="1"/>
+      <w:numFmt w:val="bullet"/>
+      <w:lvlText w:val="o"/>
+      <w:lvlJc w:val="left"/>
+      <w:pPr>
+        <w:ind w:left="3600" w:hanging="360"/>
+      </w:pPr>
+      <w:rPr>
+        <w:rFonts w:ascii="Courier New" w:hAnsi="Courier New" w:cs="Courier New" w:hint="default"/>
+      </w:rPr>
+    </w:lvl>
+    <w:lvl w:ilvl="5" w:tplc="04190005" w:tentative="1">
+      <w:start w:val="1"/>
+      <w:numFmt w:val="bullet"/>
+      <w:lvlText w:val=""/>
+      <w:lvlJc w:val="left"/>
+      <w:pPr>
+        <w:ind w:left="4320" w:hanging="360"/>
+      </w:pPr>
+      <w:rPr>
+        <w:rFonts w:ascii="Wingdings" w:hAnsi="Wingdings" w:hint="default"/>
+      </w:rPr>
+    </w:lvl>
+    <w:lvl w:ilvl="6" w:tplc="04190001" w:tentative="1">
+      <w:start w:val="1"/>
+      <w:numFmt w:val="bullet"/>
+      <w:lvlText w:val=""/>
+      <w:lvlJc w:val="left"/>
+      <w:pPr>
+        <w:ind w:left="5040" w:hanging="360"/>
+      </w:pPr>
+      <w:rPr>
+        <w:rFonts w:ascii="Symbol" w:hAnsi="Symbol" w:hint="default"/>
+      </w:rPr>
+    </w:lvl>
+    <w:lvl w:ilvl="7" w:tplc="04190003" w:tentative="1">
+      <w:start w:val="1"/>
+      <w:numFmt w:val="bullet"/>
+      <w:lvlText w:val="o"/>
+      <w:lvlJc w:val="left"/>
+      <w:pPr>
+        <w:ind w:left="5760" w:hanging="360"/>
+      </w:pPr>
+      <w:rPr>
+        <w:rFonts w:ascii="Courier New" w:hAnsi="Courier New" w:cs="Courier New" w:hint="default"/>
+      </w:rPr>
+    </w:lvl>
+    <w:lvl w:ilvl="8" w:tplc="04190005" w:tentative="1">
+      <w:start w:val="1"/>
+      <w:numFmt w:val="bullet"/>
+      <w:lvlText w:val=""/>
+      <w:lvlJc w:val="left"/>
+      <w:pPr>
+        <w:ind w:left="6480" w:hanging="360"/>
+      </w:pPr>
+      <w:rPr>
+        <w:rFonts w:ascii="Wingdings" w:hAnsi="Wingdings" w:hint="default"/>
+      </w:rPr>
+    </w:lvl>
+  </w:abstractNum>
+  <w:num w:numId="1" w16cid:durableId="1108237184">
+    <w:abstractNumId w:val="0"/>
+  </w:num>
+  <w:num w:numId="2" w16cid:durableId="1694188043">
+    <w:abstractNumId w:val="1"/>
+  </w:num>
+</w:numbering>
 </file>
 
 <file path=word/styles.xml><?xml version="1.0" encoding="utf-8"?>
@@ -744,7 +3130,6 @@
   <w:style w:type="character" w:default="1" w:styleId="a0">
     <w:name w:val="Default Paragraph Font"/>
     <w:uiPriority w:val="1"/>
-    <w:semiHidden/>
     <w:unhideWhenUsed/>
   </w:style>
   <w:style w:type="table" w:default="1" w:styleId="a1">
@@ -1068,7 +3453,9 @@
   </w:style>
   <w:style w:type="paragraph" w:styleId="a9">
     <w:name w:val="List Paragraph"/>
+    <w:aliases w:val="Абзац списка_курсач"/>
     <w:basedOn w:val="a"/>
+    <w:link w:val="aa"/>
     <w:uiPriority w:val="34"/>
     <w:qFormat/>
     <w:rsid w:val="007603BD"/>
@@ -1077,7 +3464,7 @@
       <w:contextualSpacing/>
     </w:pPr>
   </w:style>
-  <w:style w:type="character" w:styleId="aa">
+  <w:style w:type="character" w:styleId="ab">
     <w:name w:val="Intense Emphasis"/>
     <w:basedOn w:val="a0"/>
     <w:uiPriority w:val="21"/>
@@ -1089,11 +3476,11 @@
       <w:color w:val="2F5496" w:themeColor="accent1" w:themeShade="BF"/>
     </w:rPr>
   </w:style>
-  <w:style w:type="paragraph" w:styleId="ab">
+  <w:style w:type="paragraph" w:styleId="ac">
     <w:name w:val="Intense Quote"/>
     <w:basedOn w:val="a"/>
     <w:next w:val="a"/>
-    <w:link w:val="ac"/>
+    <w:link w:val="ad"/>
     <w:uiPriority w:val="30"/>
     <w:qFormat/>
     <w:rsid w:val="007603BD"/>
@@ -1112,10 +3499,10 @@
       <w:color w:val="2F5496" w:themeColor="accent1" w:themeShade="BF"/>
     </w:rPr>
   </w:style>
-  <w:style w:type="character" w:customStyle="1" w:styleId="ac">
+  <w:style w:type="character" w:customStyle="1" w:styleId="ad">
     <w:name w:val="Выделенная цитата Знак"/>
     <w:basedOn w:val="a0"/>
-    <w:link w:val="ab"/>
+    <w:link w:val="ac"/>
     <w:uiPriority w:val="30"/>
     <w:rsid w:val="007603BD"/>
     <w:rPr>
@@ -1130,7 +3517,7 @@
       <w14:ligatures w14:val="none"/>
     </w:rPr>
   </w:style>
-  <w:style w:type="character" w:styleId="ad">
+  <w:style w:type="character" w:styleId="ae">
     <w:name w:val="Intense Reference"/>
     <w:basedOn w:val="a0"/>
     <w:uiPriority w:val="32"/>
@@ -1142,6 +3529,60 @@
       <w:smallCaps/>
       <w:color w:val="2F5496" w:themeColor="accent1" w:themeShade="BF"/>
       <w:spacing w:val="5"/>
+    </w:rPr>
+  </w:style>
+  <w:style w:type="character" w:styleId="af">
+    <w:name w:val="Hyperlink"/>
+    <w:basedOn w:val="a0"/>
+    <w:uiPriority w:val="99"/>
+    <w:unhideWhenUsed/>
+    <w:rsid w:val="00E77E51"/>
+    <w:rPr>
+      <w:color w:val="0563C1" w:themeColor="hyperlink"/>
+      <w:u w:val="single"/>
+    </w:rPr>
+  </w:style>
+  <w:style w:type="character" w:styleId="af0">
+    <w:name w:val="Unresolved Mention"/>
+    <w:basedOn w:val="a0"/>
+    <w:uiPriority w:val="99"/>
+    <w:semiHidden/>
+    <w:unhideWhenUsed/>
+    <w:rsid w:val="00E77E51"/>
+    <w:rPr>
+      <w:color w:val="605E5C"/>
+      <w:shd w:val="clear" w:color="auto" w:fill="E1DFDD"/>
+    </w:rPr>
+  </w:style>
+  <w:style w:type="character" w:customStyle="1" w:styleId="aa">
+    <w:name w:val="Абзац списка Знак"/>
+    <w:aliases w:val="Абзац списка_курсач Знак"/>
+    <w:basedOn w:val="a0"/>
+    <w:link w:val="a9"/>
+    <w:uiPriority w:val="99"/>
+    <w:qFormat/>
+    <w:locked/>
+    <w:rsid w:val="002E3588"/>
+    <w:rPr>
+      <w:rFonts w:ascii="Times New Roman" w:hAnsi="Times New Roman" w:cs="Times New Roman"/>
+      <w:color w:val="000000"/>
+      <w:kern w:val="0"/>
+      <w:sz w:val="28"/>
+      <w:szCs w:val="20"/>
+      <w:lang w:eastAsia="ru-RU"/>
+      <w14:ligatures w14:val="none"/>
+    </w:rPr>
+  </w:style>
+  <w:style w:type="character" w:styleId="af1">
+    <w:name w:val="FollowedHyperlink"/>
+    <w:basedOn w:val="a0"/>
+    <w:uiPriority w:val="99"/>
+    <w:semiHidden/>
+    <w:unhideWhenUsed/>
+    <w:rsid w:val="002E3588"/>
+    <w:rPr>
+      <w:color w:val="954F72" w:themeColor="followedHyperlink"/>
+      <w:u w:val="single"/>
     </w:rPr>
   </w:style>
 </w:styles>
@@ -1440,4 +3881,16 @@
     </a:ext>
   </a:extLst>
 </a:theme>
+</file>
+
+<file path=customXml/item1.xml><?xml version="1.0" encoding="utf-8"?>
+<b:Sources xmlns:b="http://schemas.openxmlformats.org/officeDocument/2006/bibliography" xmlns="http://schemas.openxmlformats.org/officeDocument/2006/bibliography" SelectedStyle="\APASixthEditionOfficeOnline.xsl" StyleName="APA" Version="6"/>
+</file>
+
+<file path=customXml/itemProps1.xml><?xml version="1.0" encoding="utf-8"?>
+<ds:datastoreItem xmlns:ds="http://schemas.openxmlformats.org/officeDocument/2006/customXml" ds:itemID="{EC577C71-B072-441F-929A-DD17F4FC32F2}">
+  <ds:schemaRefs>
+    <ds:schemaRef ds:uri="http://schemas.openxmlformats.org/officeDocument/2006/bibliography"/>
+  </ds:schemaRefs>
+</ds:datastoreItem>
 </file>
</xml_diff>